<commit_message>
Add storage nodes, metadata service, chunking, hashing ring, deduplication and tests
Co-Authored-By: Claude Opus 5.5 <noreply@anthropic.com>
</commit_message>
<xml_diff>
--- a/Screenshot Guide.docx
+++ b/Screenshot Guide.docx
@@ -796,6 +796,1449 @@
         <w:t xml:space="preserve">If Kubernetes is not enabled, tick Enable Kubernetes, click Apply and wait a few minutes until it says running.</w:t>
       </w:r>
     </w:p>
+    <w:p>
+      <w:r>
+        <w:br w:type="page"/>
+      </w:r>
+    </w:p>
+    <w:p>
+      <w:pPr>
+        <w:keepNext/>
+        <w:spacing w:before="280" w:after="120"/>
+        <w:rPr>
+          <w:u w:val="single"/>
+        </w:rPr>
+      </w:pPr>
+      <w:r>
+        <w:rPr>
+          <w:b/>
+          <w:sz w:val="26"/>
+          <w:u w:val="single"/>
+        </w:rPr>
+        <w:t xml:space="preserve">Phase 2 : The storage node module</w:t>
+      </w:r>
+    </w:p>
+    <w:p>
+      <w:pPr>
+        <w:keepNext/>
+        <w:spacing w:before="280" w:after="120"/>
+        <w:rPr>
+          <w:u w:val="single"/>
+        </w:rPr>
+      </w:pPr>
+      <w:r>
+        <w:rPr>
+          <w:b/>
+          <w:sz w:val="26"/>
+          <w:u w:val="single"/>
+        </w:rPr>
+        <w:t xml:space="preserve">Screenshot 4 : Four storage nodes running in separate containers</w:t>
+      </w:r>
+    </w:p>
+    <w:p>
+      <w:pPr>
+        <w:keepNext/>
+        <w:spacing w:after="80"/>
+      </w:pPr>
+      <w:r>
+        <w:rPr>
+          <w:b/>
+        </w:rPr>
+        <w:t xml:space="preserve">What to do:</w:t>
+      </w:r>
+    </w:p>
+    <w:p>
+      <w:pPr>
+        <w:pStyle w:val="ListBullet"/>
+        <w:spacing w:after="80"/>
+      </w:pPr>
+      <w:r>
+        <w:t xml:space="preserve">Make sure Docker Desktop says Engine running.</w:t>
+      </w:r>
+    </w:p>
+    <w:p>
+      <w:pPr>
+        <w:pStyle w:val="ListBullet"/>
+        <w:spacing w:after="80"/>
+      </w:pPr>
+      <w:r>
+        <w:t xml:space="preserve">Start everything with the first command (the first build takes a few minutes).</w:t>
+      </w:r>
+    </w:p>
+    <w:p>
+      <w:pPr>
+        <w:pStyle w:val="ListBullet"/>
+        <w:spacing w:after="80"/>
+      </w:pPr>
+      <w:r>
+        <w:t xml:space="preserve">Then run the other two commands.</w:t>
+      </w:r>
+    </w:p>
+    <w:p>
+      <w:pPr>
+        <w:pStyle w:val="ListBullet"/>
+        <w:spacing w:after="80"/>
+      </w:pPr>
+      <w:r>
+        <w:t xml:space="preserve">Maximize the window and press PrtScn when the last command has printed its lines.</w:t>
+      </w:r>
+    </w:p>
+    <w:p>
+      <w:pPr>
+        <w:shd w:val="clear" w:color="auto" w:fill="F2F2F2"/>
+        <w:spacing w:after="0" w:line="240" w:lineRule="auto"/>
+        <w:ind w:left="288"/>
+      </w:pPr>
+      <w:r>
+        <w:rPr>
+          <w:rFonts w:ascii="Consolas" w:hAnsi="Consolas"/>
+          <w:sz w:val="18"/>
+        </w:rPr>
+        <w:t xml:space="preserve">docker compose up --build -d</w:t>
+      </w:r>
+    </w:p>
+    <w:p>
+      <w:pPr>
+        <w:shd w:val="clear" w:color="auto" w:fill="F2F2F2"/>
+        <w:spacing w:after="0" w:line="240" w:lineRule="auto"/>
+        <w:ind w:left="288"/>
+      </w:pPr>
+      <w:r>
+        <w:rPr>
+          <w:rFonts w:ascii="Consolas" w:hAnsi="Consolas"/>
+          <w:sz w:val="18"/>
+        </w:rPr>
+        <w:t xml:space="preserve">docker compose ps</w:t>
+      </w:r>
+    </w:p>
+    <w:p>
+      <w:pPr>
+        <w:shd w:val="clear" w:color="auto" w:fill="F2F2F2"/>
+        <w:spacing w:after="0" w:line="240" w:lineRule="auto"/>
+        <w:ind w:left="288"/>
+      </w:pPr>
+      <w:r>
+        <w:rPr>
+          <w:rFonts w:ascii="Consolas" w:hAnsi="Consolas"/>
+          <w:sz w:val="18"/>
+        </w:rPr>
+        <w:t xml:space="preserve">docker compose logs metadata</w:t>
+      </w:r>
+    </w:p>
+    <w:p/>
+    <w:p>
+      <w:pPr>
+        <w:keepNext/>
+        <w:spacing w:after="80"/>
+      </w:pPr>
+      <w:r>
+        <w:rPr>
+          <w:b/>
+        </w:rPr>
+        <w:t xml:space="preserve">What must be visible:</w:t>
+      </w:r>
+    </w:p>
+    <w:p>
+      <w:pPr>
+        <w:pStyle w:val="ListBullet"/>
+        <w:spacing w:after="80"/>
+      </w:pPr>
+      <w:r>
+        <w:t xml:space="preserve">The docker compose ps table: postgres, metadata, node1, node2, node3 and node4, all Up, with ports 9001 to 9004 for the nodes and 8000 for the metadata service.</w:t>
+      </w:r>
+    </w:p>
+    <w:p>
+      <w:pPr>
+        <w:pStyle w:val="ListBullet"/>
+        <w:spacing w:after="80"/>
+      </w:pPr>
+      <w:r>
+        <w:t xml:space="preserve">The metadata log lines "node node1 is UP" to "node node4 is UP": the heartbeats arriving.</w:t>
+      </w:r>
+    </w:p>
+    <w:p>
+      <w:pPr>
+        <w:keepNext/>
+        <w:spacing w:after="80"/>
+      </w:pPr>
+      <w:r>
+        <w:rPr>
+          <w:b/>
+        </w:rPr>
+        <w:t xml:space="preserve">It should look like this (from our test run):</w:t>
+      </w:r>
+    </w:p>
+    <w:p>
+      <w:pPr>
+        <w:shd w:val="clear" w:color="auto" w:fill="F2F2F2"/>
+        <w:spacing w:after="0" w:line="240" w:lineRule="auto"/>
+        <w:ind w:left="288"/>
+      </w:pPr>
+      <w:r>
+        <w:rPr>
+          <w:rFonts w:ascii="Consolas" w:hAnsi="Consolas"/>
+          <w:sz w:val="18"/>
+        </w:rPr>
+        <w:t xml:space="preserve">SERVICE    STATUS          PORTS</w:t>
+      </w:r>
+    </w:p>
+    <w:p>
+      <w:pPr>
+        <w:shd w:val="clear" w:color="auto" w:fill="F2F2F2"/>
+        <w:spacing w:after="0" w:line="240" w:lineRule="auto"/>
+        <w:ind w:left="288"/>
+      </w:pPr>
+      <w:r>
+        <w:rPr>
+          <w:rFonts w:ascii="Consolas" w:hAnsi="Consolas"/>
+          <w:sz w:val="18"/>
+        </w:rPr>
+        <w:t xml:space="preserve">metadata   Up 14 seconds   0.0.0.0:8000-&gt;8000/tcp</w:t>
+      </w:r>
+    </w:p>
+    <w:p>
+      <w:pPr>
+        <w:shd w:val="clear" w:color="auto" w:fill="F2F2F2"/>
+        <w:spacing w:after="0" w:line="240" w:lineRule="auto"/>
+        <w:ind w:left="288"/>
+      </w:pPr>
+      <w:r>
+        <w:rPr>
+          <w:rFonts w:ascii="Consolas" w:hAnsi="Consolas"/>
+          <w:sz w:val="18"/>
+        </w:rPr>
+        <w:t xml:space="preserve">node1      Up 13 seconds   0.0.0.0:9001-&gt;9000/tcp</w:t>
+      </w:r>
+    </w:p>
+    <w:p>
+      <w:pPr>
+        <w:shd w:val="clear" w:color="auto" w:fill="F2F2F2"/>
+        <w:spacing w:after="0" w:line="240" w:lineRule="auto"/>
+        <w:ind w:left="288"/>
+      </w:pPr>
+      <w:r>
+        <w:rPr>
+          <w:rFonts w:ascii="Consolas" w:hAnsi="Consolas"/>
+          <w:sz w:val="18"/>
+        </w:rPr>
+        <w:t xml:space="preserve">node2      Up 13 seconds   0.0.0.0:9002-&gt;9000/tcp</w:t>
+      </w:r>
+    </w:p>
+    <w:p>
+      <w:pPr>
+        <w:shd w:val="clear" w:color="auto" w:fill="F2F2F2"/>
+        <w:spacing w:after="0" w:line="240" w:lineRule="auto"/>
+        <w:ind w:left="288"/>
+      </w:pPr>
+      <w:r>
+        <w:rPr>
+          <w:rFonts w:ascii="Consolas" w:hAnsi="Consolas"/>
+          <w:sz w:val="18"/>
+        </w:rPr>
+        <w:t xml:space="preserve">node3      Up 13 seconds   0.0.0.0:9003-&gt;9000/tcp</w:t>
+      </w:r>
+    </w:p>
+    <w:p>
+      <w:pPr>
+        <w:shd w:val="clear" w:color="auto" w:fill="F2F2F2"/>
+        <w:spacing w:after="0" w:line="240" w:lineRule="auto"/>
+        <w:ind w:left="288"/>
+      </w:pPr>
+      <w:r>
+        <w:rPr>
+          <w:rFonts w:ascii="Consolas" w:hAnsi="Consolas"/>
+          <w:sz w:val="18"/>
+        </w:rPr>
+        <w:t xml:space="preserve">node4      Up 14 seconds   0.0.0.0:9004-&gt;9000/tcp</w:t>
+      </w:r>
+    </w:p>
+    <w:p>
+      <w:pPr>
+        <w:shd w:val="clear" w:color="auto" w:fill="F2F2F2"/>
+        <w:spacing w:after="0" w:line="240" w:lineRule="auto"/>
+        <w:ind w:left="288"/>
+      </w:pPr>
+      <w:r>
+        <w:rPr>
+          <w:rFonts w:ascii="Consolas" w:hAnsi="Consolas"/>
+          <w:sz w:val="18"/>
+        </w:rPr>
+        <w:t xml:space="preserve">postgres   Up 14 seconds   0.0.0.0:5433-&gt;5432/tcp</w:t>
+      </w:r>
+    </w:p>
+    <w:p>
+      <w:pPr>
+        <w:shd w:val="clear" w:color="auto" w:fill="F2F2F2"/>
+        <w:spacing w:after="0" w:line="240" w:lineRule="auto"/>
+        <w:ind w:left="288"/>
+      </w:pPr>
+      <w:r>
+        <w:rPr>
+          <w:rFonts w:ascii="Consolas" w:hAnsi="Consolas"/>
+          <w:sz w:val="18"/>
+        </w:rPr>
+        <w:t xml:space="preserve">metadata-1  | [metadata] node node4 is UP at http://node4:9000</w:t>
+      </w:r>
+    </w:p>
+    <w:p>
+      <w:pPr>
+        <w:shd w:val="clear" w:color="auto" w:fill="F2F2F2"/>
+        <w:spacing w:after="0" w:line="240" w:lineRule="auto"/>
+        <w:ind w:left="288"/>
+      </w:pPr>
+      <w:r>
+        <w:rPr>
+          <w:rFonts w:ascii="Consolas" w:hAnsi="Consolas"/>
+          <w:sz w:val="18"/>
+        </w:rPr>
+        <w:t xml:space="preserve">metadata-1  | [metadata] node node1 is UP at http://node1:9000</w:t>
+      </w:r>
+    </w:p>
+    <w:p/>
+    <w:p>
+      <w:r>
+        <w:br w:type="page"/>
+      </w:r>
+    </w:p>
+    <w:p>
+      <w:pPr>
+        <w:keepNext/>
+        <w:spacing w:before="280" w:after="120"/>
+        <w:rPr>
+          <w:u w:val="single"/>
+        </w:rPr>
+      </w:pPr>
+      <w:r>
+        <w:rPr>
+          <w:b/>
+          <w:sz w:val="26"/>
+          <w:u w:val="single"/>
+        </w:rPr>
+        <w:t xml:space="preserve">Screenshot 5 : Heartbeats received by the metadata service</w:t>
+      </w:r>
+    </w:p>
+    <w:p>
+      <w:pPr>
+        <w:keepNext/>
+        <w:spacing w:after="80"/>
+      </w:pPr>
+      <w:r>
+        <w:rPr>
+          <w:b/>
+        </w:rPr>
+        <w:t xml:space="preserve">What to do:</w:t>
+      </w:r>
+    </w:p>
+    <w:p>
+      <w:pPr>
+        <w:pStyle w:val="ListBullet"/>
+        <w:spacing w:after="80"/>
+      </w:pPr>
+      <w:r>
+        <w:t xml:space="preserve">With the containers running, open this address in the browser:</w:t>
+      </w:r>
+    </w:p>
+    <w:p>
+      <w:pPr>
+        <w:pStyle w:val="ListBullet"/>
+        <w:spacing w:after="80"/>
+      </w:pPr>
+      <w:r>
+        <w:t xml:space="preserve">Tick Pretty-print if the browser offers it, maximize the window and press PrtScn.</w:t>
+      </w:r>
+    </w:p>
+    <w:p>
+      <w:pPr>
+        <w:shd w:val="clear" w:color="auto" w:fill="F2F2F2"/>
+        <w:spacing w:after="0" w:line="240" w:lineRule="auto"/>
+        <w:ind w:left="288"/>
+      </w:pPr>
+      <w:r>
+        <w:rPr>
+          <w:rFonts w:ascii="Consolas" w:hAnsi="Consolas"/>
+          <w:sz w:val="18"/>
+        </w:rPr>
+        <w:t xml:space="preserve">http://localhost:8000/nodes</w:t>
+      </w:r>
+    </w:p>
+    <w:p/>
+    <w:p>
+      <w:pPr>
+        <w:keepNext/>
+        <w:spacing w:after="80"/>
+      </w:pPr>
+      <w:r>
+        <w:rPr>
+          <w:b/>
+        </w:rPr>
+        <w:t xml:space="preserve">What must be visible:</w:t>
+      </w:r>
+    </w:p>
+    <w:p>
+      <w:pPr>
+        <w:pStyle w:val="ListBullet"/>
+        <w:spacing w:after="80"/>
+      </w:pPr>
+      <w:r>
+        <w:t xml:space="preserve">One entry for each of node1 to node4 with its node_id, free_bytes, chunk_count, alive: true and seconds_since_heartbeat below 3.</w:t>
+      </w:r>
+    </w:p>
+    <w:p>
+      <w:r>
+        <w:br w:type="page"/>
+      </w:r>
+    </w:p>
+    <w:p>
+      <w:pPr>
+        <w:keepNext/>
+        <w:spacing w:before="280" w:after="120"/>
+        <w:rPr>
+          <w:u w:val="single"/>
+        </w:rPr>
+      </w:pPr>
+      <w:r>
+        <w:rPr>
+          <w:b/>
+          <w:sz w:val="26"/>
+          <w:u w:val="single"/>
+        </w:rPr>
+        <w:t xml:space="preserve">Screenshot 6 : Storage node: put, get, head, delete and corruption check</w:t>
+      </w:r>
+    </w:p>
+    <w:p>
+      <w:pPr>
+        <w:keepNext/>
+        <w:spacing w:after="80"/>
+      </w:pPr>
+      <w:r>
+        <w:rPr>
+          <w:b/>
+        </w:rPr>
+        <w:t xml:space="preserve">What to do:</w:t>
+      </w:r>
+    </w:p>
+    <w:p>
+      <w:pPr>
+        <w:pStyle w:val="ListBullet"/>
+        <w:spacing w:after="80"/>
+      </w:pPr>
+      <w:r>
+        <w:t xml:space="preserve">In PowerShell (virtual environment active), run the test script.</w:t>
+      </w:r>
+    </w:p>
+    <w:p>
+      <w:pPr>
+        <w:pStyle w:val="ListBullet"/>
+        <w:spacing w:after="80"/>
+      </w:pPr>
+      <w:r>
+        <w:t xml:space="preserve">Maximize the window and press PrtScn.</w:t>
+      </w:r>
+    </w:p>
+    <w:p>
+      <w:pPr>
+        <w:shd w:val="clear" w:color="auto" w:fill="F2F2F2"/>
+        <w:spacing w:after="0" w:line="240" w:lineRule="auto"/>
+        <w:ind w:left="288"/>
+      </w:pPr>
+      <w:r>
+        <w:rPr>
+          <w:rFonts w:ascii="Consolas" w:hAnsi="Consolas"/>
+          <w:sz w:val="18"/>
+        </w:rPr>
+        <w:t xml:space="preserve">python scripts/test_node.py</w:t>
+      </w:r>
+    </w:p>
+    <w:p/>
+    <w:p>
+      <w:pPr>
+        <w:keepNext/>
+        <w:spacing w:after="80"/>
+      </w:pPr>
+      <w:r>
+        <w:rPr>
+          <w:b/>
+        </w:rPr>
+        <w:t xml:space="preserve">What must be visible:</w:t>
+      </w:r>
+    </w:p>
+    <w:p>
+      <w:pPr>
+        <w:pStyle w:val="ListBullet"/>
+        <w:spacing w:after="80"/>
+      </w:pPr>
+      <w:r>
+        <w:t xml:space="preserve">PASS for PUT, HEAD, GET and DELETE.</w:t>
+      </w:r>
+    </w:p>
+    <w:p>
+      <w:pPr>
+        <w:pStyle w:val="ListBullet"/>
+        <w:spacing w:after="80"/>
+      </w:pPr>
+      <w:r>
+        <w:t xml:space="preserve">PASS for the PUT with a wrong hash being rejected.</w:t>
+      </w:r>
+    </w:p>
+    <w:p>
+      <w:pPr>
+        <w:pStyle w:val="ListBullet"/>
+        <w:spacing w:after="80"/>
+      </w:pPr>
+      <w:r>
+        <w:t xml:space="preserve">The corruption part: 4 bytes changed inside the node1 container, then the GET refused and the chunk moved to quarantine.</w:t>
+      </w:r>
+    </w:p>
+    <w:p>
+      <w:pPr>
+        <w:pStyle w:val="ListBullet"/>
+        <w:spacing w:after="80"/>
+      </w:pPr>
+      <w:r>
+        <w:t xml:space="preserve">The node status line at the end (node_id, free_bytes, chunk_count).</w:t>
+      </w:r>
+    </w:p>
+    <w:p>
+      <w:pPr>
+        <w:keepNext/>
+        <w:spacing w:after="80"/>
+      </w:pPr>
+      <w:r>
+        <w:rPr>
+          <w:b/>
+        </w:rPr>
+        <w:t xml:space="preserve">It should look like this (from our test run):</w:t>
+      </w:r>
+    </w:p>
+    <w:p>
+      <w:pPr>
+        <w:shd w:val="clear" w:color="auto" w:fill="F2F2F2"/>
+        <w:spacing w:after="0" w:line="240" w:lineRule="auto"/>
+        <w:ind w:left="288"/>
+      </w:pPr>
+      <w:r>
+        <w:rPr>
+          <w:rFonts w:ascii="Consolas" w:hAnsi="Consolas"/>
+          <w:sz w:val="18"/>
+        </w:rPr>
+        <w:t xml:space="preserve">  PASS  PUT stores the chunk   ({'stored': True, 'size': 200000})</w:t>
+      </w:r>
+    </w:p>
+    <w:p>
+      <w:pPr>
+        <w:shd w:val="clear" w:color="auto" w:fill="F2F2F2"/>
+        <w:spacing w:after="0" w:line="240" w:lineRule="auto"/>
+        <w:ind w:left="288"/>
+      </w:pPr>
+      <w:r>
+        <w:rPr>
+          <w:rFonts w:ascii="Consolas" w:hAnsi="Consolas"/>
+          <w:sz w:val="18"/>
+        </w:rPr>
+        <w:t xml:space="preserve">  PASS  HEAD finds it and gives its size   (Content-Length 200000)</w:t>
+      </w:r>
+    </w:p>
+    <w:p>
+      <w:pPr>
+        <w:shd w:val="clear" w:color="auto" w:fill="F2F2F2"/>
+        <w:spacing w:after="0" w:line="240" w:lineRule="auto"/>
+        <w:ind w:left="288"/>
+      </w:pPr>
+      <w:r>
+        <w:rPr>
+          <w:rFonts w:ascii="Consolas" w:hAnsi="Consolas"/>
+          <w:sz w:val="18"/>
+        </w:rPr>
+        <w:t xml:space="preserve">  PASS  GET returns the same bytes (hash checked)</w:t>
+      </w:r>
+    </w:p>
+    <w:p>
+      <w:pPr>
+        <w:shd w:val="clear" w:color="auto" w:fill="F2F2F2"/>
+        <w:spacing w:after="0" w:line="240" w:lineRule="auto"/>
+        <w:ind w:left="288"/>
+      </w:pPr>
+      <w:r>
+        <w:rPr>
+          <w:rFonts w:ascii="Consolas" w:hAnsi="Consolas"/>
+          <w:sz w:val="18"/>
+        </w:rPr>
+        <w:t xml:space="preserve">  PASS  PUT with a hash that does not match the content is rejected</w:t>
+      </w:r>
+    </w:p>
+    <w:p>
+      <w:pPr>
+        <w:shd w:val="clear" w:color="auto" w:fill="F2F2F2"/>
+        <w:spacing w:after="0" w:line="240" w:lineRule="auto"/>
+        <w:ind w:left="288"/>
+      </w:pPr>
+      <w:r>
+        <w:rPr>
+          <w:rFonts w:ascii="Consolas" w:hAnsi="Consolas"/>
+          <w:sz w:val="18"/>
+        </w:rPr>
+        <w:t xml:space="preserve">  PASS  DELETE removes it</w:t>
+      </w:r>
+    </w:p>
+    <w:p>
+      <w:pPr>
+        <w:shd w:val="clear" w:color="auto" w:fill="F2F2F2"/>
+        <w:spacing w:after="0" w:line="240" w:lineRule="auto"/>
+        <w:ind w:left="288"/>
+      </w:pPr>
+      <w:r>
+        <w:rPr>
+          <w:rFonts w:ascii="Consolas" w:hAnsi="Consolas"/>
+          <w:sz w:val="18"/>
+        </w:rPr>
+        <w:t xml:space="preserve">Corruption on disk</w:t>
+      </w:r>
+    </w:p>
+    <w:p>
+      <w:pPr>
+        <w:shd w:val="clear" w:color="auto" w:fill="F2F2F2"/>
+        <w:spacing w:after="0" w:line="240" w:lineRule="auto"/>
+        <w:ind w:left="288"/>
+      </w:pPr>
+      <w:r>
+        <w:rPr>
+          <w:rFonts w:ascii="Consolas" w:hAnsi="Consolas"/>
+          <w:sz w:val="18"/>
+        </w:rPr>
+        <w:t xml:space="preserve">  changed 4 bytes of chunk 68633f009cb2210f... inside the node1 container</w:t>
+      </w:r>
+    </w:p>
+    <w:p>
+      <w:pPr>
+        <w:shd w:val="clear" w:color="auto" w:fill="F2F2F2"/>
+        <w:spacing w:after="0" w:line="240" w:lineRule="auto"/>
+        <w:ind w:left="288"/>
+      </w:pPr>
+      <w:r>
+        <w:rPr>
+          <w:rFonts w:ascii="Consolas" w:hAnsi="Consolas"/>
+          <w:sz w:val="18"/>
+        </w:rPr>
+        <w:t xml:space="preserve">  PASS  GET refuses the corrupted chunk   (chunk is corrupted on this node)</w:t>
+      </w:r>
+    </w:p>
+    <w:p>
+      <w:pPr>
+        <w:shd w:val="clear" w:color="auto" w:fill="F2F2F2"/>
+        <w:spacing w:after="0" w:line="240" w:lineRule="auto"/>
+        <w:ind w:left="288"/>
+      </w:pPr>
+      <w:r>
+        <w:rPr>
+          <w:rFonts w:ascii="Consolas" w:hAnsi="Consolas"/>
+          <w:sz w:val="18"/>
+        </w:rPr>
+        <w:t xml:space="preserve">  PASS  the corrupted chunk is moved to quarantine</w:t>
+      </w:r>
+    </w:p>
+    <w:p/>
+    <w:p>
+      <w:r>
+        <w:br w:type="page"/>
+      </w:r>
+    </w:p>
+    <w:p>
+      <w:pPr>
+        <w:keepNext/>
+        <w:spacing w:before="280" w:after="120"/>
+        <w:rPr>
+          <w:u w:val="single"/>
+        </w:rPr>
+      </w:pPr>
+      <w:r>
+        <w:rPr>
+          <w:b/>
+          <w:sz w:val="26"/>
+          <w:u w:val="single"/>
+        </w:rPr>
+        <w:t xml:space="preserve">Phase 3 : The metadata and placement module</w:t>
+      </w:r>
+    </w:p>
+    <w:p>
+      <w:pPr>
+        <w:keepNext/>
+        <w:spacing w:before="280" w:after="120"/>
+        <w:rPr>
+          <w:u w:val="single"/>
+        </w:rPr>
+      </w:pPr>
+      <w:r>
+        <w:rPr>
+          <w:b/>
+          <w:sz w:val="26"/>
+          <w:u w:val="single"/>
+        </w:rPr>
+        <w:t xml:space="preserve">Screenshot 7 : An upload and its metadata in PostgreSQL</w:t>
+      </w:r>
+    </w:p>
+    <w:p>
+      <w:pPr>
+        <w:keepNext/>
+        <w:spacing w:after="80"/>
+      </w:pPr>
+      <w:r>
+        <w:rPr>
+          <w:b/>
+        </w:rPr>
+        <w:t xml:space="preserve">What to do:</w:t>
+      </w:r>
+    </w:p>
+    <w:p>
+      <w:pPr>
+        <w:pStyle w:val="ListBullet"/>
+        <w:spacing w:after="80"/>
+      </w:pPr>
+      <w:r>
+        <w:t xml:space="preserve">Upload two files: a small one with fixed chunks and a bigger one with content-defined chunks (any file of a few MB works for the second, for example a photo or a PDF; replace the path).</w:t>
+      </w:r>
+    </w:p>
+    <w:p>
+      <w:pPr>
+        <w:pStyle w:val="ListBullet"/>
+        <w:spacing w:after="80"/>
+      </w:pPr>
+      <w:r>
+        <w:t xml:space="preserve">Then show what PostgreSQL stores with the last command.</w:t>
+      </w:r>
+    </w:p>
+    <w:p>
+      <w:pPr>
+        <w:pStyle w:val="ListBullet"/>
+        <w:spacing w:after="80"/>
+      </w:pPr>
+      <w:r>
+        <w:t xml:space="preserve">Maximize the window and press PrtScn.</w:t>
+      </w:r>
+    </w:p>
+    <w:p>
+      <w:pPr>
+        <w:shd w:val="clear" w:color="auto" w:fill="F2F2F2"/>
+        <w:spacing w:after="0" w:line="240" w:lineRule="auto"/>
+        <w:ind w:left="288"/>
+      </w:pPr>
+      <w:r>
+        <w:rPr>
+          <w:rFonts w:ascii="Consolas" w:hAnsi="Consolas"/>
+          <w:sz w:val="18"/>
+        </w:rPr>
+        <w:t xml:space="preserve">curl.exe -T README.md http://localhost:8000/objects/demo/README.md</w:t>
+      </w:r>
+    </w:p>
+    <w:p>
+      <w:pPr>
+        <w:shd w:val="clear" w:color="auto" w:fill="F2F2F2"/>
+        <w:spacing w:after="0" w:line="240" w:lineRule="auto"/>
+        <w:ind w:left="288"/>
+      </w:pPr>
+      <w:r>
+        <w:rPr>
+          <w:rFonts w:ascii="Consolas" w:hAnsi="Consolas"/>
+          <w:sz w:val="18"/>
+        </w:rPr>
+        <w:t xml:space="preserve">curl.exe -T "C:\path\to\some-file.pdf" "http://localhost:8000/objects/demo/file.pdf?chunking=cdc"</w:t>
+      </w:r>
+    </w:p>
+    <w:p>
+      <w:pPr>
+        <w:shd w:val="clear" w:color="auto" w:fill="F2F2F2"/>
+        <w:spacing w:after="0" w:line="240" w:lineRule="auto"/>
+        <w:ind w:left="288"/>
+      </w:pPr>
+      <w:r>
+        <w:rPr>
+          <w:rFonts w:ascii="Consolas" w:hAnsi="Consolas"/>
+          <w:sz w:val="18"/>
+        </w:rPr>
+        <w:t xml:space="preserve">docker compose exec postgres psql -U storage -c "SELECT bucket, key, version, size, chunking, cardinality(chunk_hashes) AS chunks, created_at FROM objects;" -c "SELECT left(hash,16) AS chunk, size, refcount, nodes FROM chunks;"</w:t>
+      </w:r>
+    </w:p>
+    <w:p/>
+    <w:p>
+      <w:pPr>
+        <w:keepNext/>
+        <w:spacing w:after="80"/>
+      </w:pPr>
+      <w:r>
+        <w:rPr>
+          <w:b/>
+        </w:rPr>
+        <w:t xml:space="preserve">What must be visible:</w:t>
+      </w:r>
+    </w:p>
+    <w:p>
+      <w:pPr>
+        <w:pStyle w:val="ListBullet"/>
+        <w:spacing w:after="80"/>
+      </w:pPr>
+      <w:r>
+        <w:t xml:space="preserve">The two upload answers (version, size, number of chunks, new and deduplicated chunks).</w:t>
+      </w:r>
+    </w:p>
+    <w:p>
+      <w:pPr>
+        <w:pStyle w:val="ListBullet"/>
+        <w:spacing w:after="80"/>
+      </w:pPr>
+      <w:r>
+        <w:t xml:space="preserve">The objects table: bucket, key, version, size, chunking, chunk count, creation date.</w:t>
+      </w:r>
+    </w:p>
+    <w:p>
+      <w:pPr>
+        <w:pStyle w:val="ListBullet"/>
+        <w:spacing w:after="80"/>
+      </w:pPr>
+      <w:r>
+        <w:t xml:space="preserve">The chunks table: each chunk with its size, reference count and the 3 nodes chosen by the ring.</w:t>
+      </w:r>
+    </w:p>
+    <w:p>
+      <w:pPr>
+        <w:keepNext/>
+        <w:spacing w:after="80"/>
+      </w:pPr>
+      <w:r>
+        <w:rPr>
+          <w:b/>
+        </w:rPr>
+        <w:t xml:space="preserve">It should look like this (from our test run):</w:t>
+      </w:r>
+    </w:p>
+    <w:p>
+      <w:pPr>
+        <w:shd w:val="clear" w:color="auto" w:fill="F2F2F2"/>
+        <w:spacing w:after="0" w:line="240" w:lineRule="auto"/>
+        <w:ind w:left="288"/>
+      </w:pPr>
+      <w:r>
+        <w:rPr>
+          <w:rFonts w:ascii="Consolas" w:hAnsi="Consolas"/>
+          <w:sz w:val="18"/>
+        </w:rPr>
+        <w:t xml:space="preserve"> bucket |    key     | version |  size   | chunking | chunks |          created_at</w:t>
+      </w:r>
+    </w:p>
+    <w:p>
+      <w:pPr>
+        <w:shd w:val="clear" w:color="auto" w:fill="F2F2F2"/>
+        <w:spacing w:after="0" w:line="240" w:lineRule="auto"/>
+        <w:ind w:left="288"/>
+      </w:pPr>
+      <w:r>
+        <w:rPr>
+          <w:rFonts w:ascii="Consolas" w:hAnsi="Consolas"/>
+          <w:sz w:val="18"/>
+        </w:rPr>
+        <w:t xml:space="preserve"> demo   | README.md  |       1 |     558 | fixed    |      1 | 2026-10-29 09:58:05+00</w:t>
+      </w:r>
+    </w:p>
+    <w:p>
+      <w:pPr>
+        <w:shd w:val="clear" w:color="auto" w:fill="F2F2F2"/>
+        <w:spacing w:after="0" w:line="240" w:lineRule="auto"/>
+        <w:ind w:left="288"/>
+      </w:pPr>
+      <w:r>
+        <w:rPr>
+          <w:rFonts w:ascii="Consolas" w:hAnsi="Consolas"/>
+          <w:sz w:val="18"/>
+        </w:rPr>
+        <w:t xml:space="preserve"> demo   | random.bin |       1 | 9000000 | cdc      |      2 | 2026-10-29 09:58:05+00</w:t>
+      </w:r>
+    </w:p>
+    <w:p>
+      <w:pPr>
+        <w:shd w:val="clear" w:color="auto" w:fill="F2F2F2"/>
+        <w:spacing w:after="0" w:line="240" w:lineRule="auto"/>
+        <w:ind w:left="288"/>
+      </w:pPr>
+      <w:r>
+        <w:rPr>
+          <w:rFonts w:ascii="Consolas" w:hAnsi="Consolas"/>
+          <w:sz w:val="18"/>
+        </w:rPr>
+        <w:t xml:space="preserve"/>
+      </w:r>
+    </w:p>
+    <w:p>
+      <w:pPr>
+        <w:shd w:val="clear" w:color="auto" w:fill="F2F2F2"/>
+        <w:spacing w:after="0" w:line="240" w:lineRule="auto"/>
+        <w:ind w:left="288"/>
+      </w:pPr>
+      <w:r>
+        <w:rPr>
+          <w:rFonts w:ascii="Consolas" w:hAnsi="Consolas"/>
+          <w:sz w:val="18"/>
+        </w:rPr>
+        <w:t xml:space="preserve">      chunk       |  size   | refcount |        nodes</w:t>
+      </w:r>
+    </w:p>
+    <w:p>
+      <w:pPr>
+        <w:shd w:val="clear" w:color="auto" w:fill="F2F2F2"/>
+        <w:spacing w:after="0" w:line="240" w:lineRule="auto"/>
+        <w:ind w:left="288"/>
+      </w:pPr>
+      <w:r>
+        <w:rPr>
+          <w:rFonts w:ascii="Consolas" w:hAnsi="Consolas"/>
+          <w:sz w:val="18"/>
+        </w:rPr>
+        <w:t xml:space="preserve"> c1c80b27690e7748 |     558 |        1 | {node3,node1,node4}</w:t>
+      </w:r>
+    </w:p>
+    <w:p>
+      <w:pPr>
+        <w:shd w:val="clear" w:color="auto" w:fill="F2F2F2"/>
+        <w:spacing w:after="0" w:line="240" w:lineRule="auto"/>
+        <w:ind w:left="288"/>
+      </w:pPr>
+      <w:r>
+        <w:rPr>
+          <w:rFonts w:ascii="Consolas" w:hAnsi="Consolas"/>
+          <w:sz w:val="18"/>
+        </w:rPr>
+        <w:t xml:space="preserve"> 908e896b44d43520 | 4848633 |        1 | {node1,node4,node3}</w:t>
+      </w:r>
+    </w:p>
+    <w:p/>
+    <w:p>
+      <w:r>
+        <w:br w:type="page"/>
+      </w:r>
+    </w:p>
+    <w:p>
+      <w:pPr>
+        <w:keepNext/>
+        <w:spacing w:before="280" w:after="120"/>
+        <w:rPr>
+          <w:u w:val="single"/>
+        </w:rPr>
+      </w:pPr>
+      <w:r>
+        <w:rPr>
+          <w:b/>
+          <w:sz w:val="26"/>
+          <w:u w:val="single"/>
+        </w:rPr>
+        <w:t xml:space="preserve">Screenshot 8 : Deduplication with reference counting</w:t>
+      </w:r>
+    </w:p>
+    <w:p>
+      <w:pPr>
+        <w:keepNext/>
+        <w:spacing w:after="80"/>
+      </w:pPr>
+      <w:r>
+        <w:rPr>
+          <w:b/>
+        </w:rPr>
+        <w:t xml:space="preserve">What to do:</w:t>
+      </w:r>
+    </w:p>
+    <w:p>
+      <w:pPr>
+        <w:pStyle w:val="ListBullet"/>
+        <w:spacing w:after="80"/>
+      </w:pPr>
+      <w:r>
+        <w:t xml:space="preserve">Run the test script and press PrtScn when it finishes.</w:t>
+      </w:r>
+    </w:p>
+    <w:p>
+      <w:pPr>
+        <w:shd w:val="clear" w:color="auto" w:fill="F2F2F2"/>
+        <w:spacing w:after="0" w:line="240" w:lineRule="auto"/>
+        <w:ind w:left="288"/>
+      </w:pPr>
+      <w:r>
+        <w:rPr>
+          <w:rFonts w:ascii="Consolas" w:hAnsi="Consolas"/>
+          <w:sz w:val="18"/>
+        </w:rPr>
+        <w:t xml:space="preserve">python scripts/test_dedup.py</w:t>
+      </w:r>
+    </w:p>
+    <w:p/>
+    <w:p>
+      <w:pPr>
+        <w:keepNext/>
+        <w:spacing w:after="80"/>
+      </w:pPr>
+      <w:r>
+        <w:rPr>
+          <w:b/>
+        </w:rPr>
+        <w:t xml:space="preserve">What must be visible:</w:t>
+      </w:r>
+    </w:p>
+    <w:p>
+      <w:pPr>
+        <w:pStyle w:val="ListBullet"/>
+        <w:spacing w:after="80"/>
+      </w:pPr>
+      <w:r>
+        <w:t xml:space="preserve">The second upload of the same content: 0 new chunks, all deduplicated.</w:t>
+      </w:r>
+    </w:p>
+    <w:p>
+      <w:pPr>
+        <w:pStyle w:val="ListBullet"/>
+        <w:spacing w:after="80"/>
+      </w:pPr>
+      <w:r>
+        <w:t xml:space="preserve">Each chunk stored once but referenced twice.</w:t>
+      </w:r>
+    </w:p>
+    <w:p>
+      <w:pPr>
+        <w:pStyle w:val="ListBullet"/>
+        <w:spacing w:after="80"/>
+      </w:pPr>
+      <w:r>
+        <w:t xml:space="preserve">After deleting the first object the chunks are still there; after deleting the second they are removed.</w:t>
+      </w:r>
+    </w:p>
+    <w:p>
+      <w:pPr>
+        <w:pStyle w:val="ListBullet"/>
+        <w:spacing w:after="80"/>
+      </w:pPr>
+      <w:r>
+        <w:t xml:space="preserve">Every line PASS.</w:t>
+      </w:r>
+    </w:p>
+    <w:p>
+      <w:pPr>
+        <w:keepNext/>
+        <w:spacing w:after="80"/>
+      </w:pPr>
+      <w:r>
+        <w:rPr>
+          <w:b/>
+        </w:rPr>
+        <w:t xml:space="preserve">It should look like this (from our test run):</w:t>
+      </w:r>
+    </w:p>
+    <w:p>
+      <w:pPr>
+        <w:shd w:val="clear" w:color="auto" w:fill="F2F2F2"/>
+        <w:spacing w:after="0" w:line="240" w:lineRule="auto"/>
+        <w:ind w:left="288"/>
+      </w:pPr>
+      <w:r>
+        <w:rPr>
+          <w:rFonts w:ascii="Consolas" w:hAnsi="Consolas"/>
+          <w:sz w:val="18"/>
+        </w:rPr>
+        <w:t xml:space="preserve">  upload original.bin: 3 chunks, 3 new, 0 deduplicated</w:t>
+      </w:r>
+    </w:p>
+    <w:p>
+      <w:pPr>
+        <w:shd w:val="clear" w:color="auto" w:fill="F2F2F2"/>
+        <w:spacing w:after="0" w:line="240" w:lineRule="auto"/>
+        <w:ind w:left="288"/>
+      </w:pPr>
+      <w:r>
+        <w:rPr>
+          <w:rFonts w:ascii="Consolas" w:hAnsi="Consolas"/>
+          <w:sz w:val="18"/>
+        </w:rPr>
+        <w:t xml:space="preserve">  upload copy.bin:     3 chunks, 0 new, 3 deduplicated</w:t>
+      </w:r>
+    </w:p>
+    <w:p>
+      <w:pPr>
+        <w:shd w:val="clear" w:color="auto" w:fill="F2F2F2"/>
+        <w:spacing w:after="0" w:line="240" w:lineRule="auto"/>
+        <w:ind w:left="288"/>
+      </w:pPr>
+      <w:r>
+        <w:rPr>
+          <w:rFonts w:ascii="Consolas" w:hAnsi="Consolas"/>
+          <w:sz w:val="18"/>
+        </w:rPr>
+        <w:t xml:space="preserve">  PASS  the identical copy stores no new chunk</w:t>
+      </w:r>
+    </w:p>
+    <w:p>
+      <w:pPr>
+        <w:shd w:val="clear" w:color="auto" w:fill="F2F2F2"/>
+        <w:spacing w:after="0" w:line="240" w:lineRule="auto"/>
+        <w:ind w:left="288"/>
+      </w:pPr>
+      <w:r>
+        <w:rPr>
+          <w:rFonts w:ascii="Consolas" w:hAnsi="Consolas"/>
+          <w:sz w:val="18"/>
+        </w:rPr>
+        <w:t xml:space="preserve">  PASS  each chunk is stored once but referenced twice   (+3 unique chunks, +6 references)</w:t>
+      </w:r>
+    </w:p>
+    <w:p>
+      <w:pPr>
+        <w:shd w:val="clear" w:color="auto" w:fill="F2F2F2"/>
+        <w:spacing w:after="0" w:line="240" w:lineRule="auto"/>
+        <w:ind w:left="288"/>
+      </w:pPr>
+      <w:r>
+        <w:rPr>
+          <w:rFonts w:ascii="Consolas" w:hAnsi="Consolas"/>
+          <w:sz w:val="18"/>
+        </w:rPr>
+        <w:t xml:space="preserve">  PASS  reading copy.bin returns the exact content</w:t>
+      </w:r>
+    </w:p>
+    <w:p>
+      <w:pPr>
+        <w:shd w:val="clear" w:color="auto" w:fill="F2F2F2"/>
+        <w:spacing w:after="0" w:line="240" w:lineRule="auto"/>
+        <w:ind w:left="288"/>
+      </w:pPr>
+      <w:r>
+        <w:rPr>
+          <w:rFonts w:ascii="Consolas" w:hAnsi="Consolas"/>
+          <w:sz w:val="18"/>
+        </w:rPr>
+        <w:t xml:space="preserve">  PASS  after deleting original.bin the chunks are still there   (references now +3)</w:t>
+      </w:r>
+    </w:p>
+    <w:p>
+      <w:pPr>
+        <w:shd w:val="clear" w:color="auto" w:fill="F2F2F2"/>
+        <w:spacing w:after="0" w:line="240" w:lineRule="auto"/>
+        <w:ind w:left="288"/>
+      </w:pPr>
+      <w:r>
+        <w:rPr>
+          <w:rFonts w:ascii="Consolas" w:hAnsi="Consolas"/>
+          <w:sz w:val="18"/>
+        </w:rPr>
+        <w:t xml:space="preserve">  PASS  copy.bin can still be read</w:t>
+      </w:r>
+    </w:p>
+    <w:p>
+      <w:pPr>
+        <w:shd w:val="clear" w:color="auto" w:fill="F2F2F2"/>
+        <w:spacing w:after="0" w:line="240" w:lineRule="auto"/>
+        <w:ind w:left="288"/>
+      </w:pPr>
+      <w:r>
+        <w:rPr>
+          <w:rFonts w:ascii="Consolas" w:hAnsi="Consolas"/>
+          <w:sz w:val="18"/>
+        </w:rPr>
+        <w:t xml:space="preserve">  PASS  after deleting copy.bin the unused chunks are removed   (3 chunks removed from the nodes)</w:t>
+      </w:r>
+    </w:p>
+    <w:p/>
+    <w:p>
+      <w:r>
+        <w:br w:type="page"/>
+      </w:r>
+    </w:p>
+    <w:p>
+      <w:pPr>
+        <w:keepNext/>
+        <w:spacing w:before="280" w:after="120"/>
+        <w:rPr>
+          <w:u w:val="single"/>
+        </w:rPr>
+      </w:pPr>
+      <w:r>
+        <w:rPr>
+          <w:b/>
+          <w:sz w:val="26"/>
+          <w:u w:val="single"/>
+        </w:rPr>
+        <w:t xml:space="preserve">Screenshot 9 : Fixed-size chunking compared with FastCDC</w:t>
+      </w:r>
+    </w:p>
+    <w:p>
+      <w:pPr>
+        <w:keepNext/>
+        <w:spacing w:after="80"/>
+      </w:pPr>
+      <w:r>
+        <w:rPr>
+          <w:b/>
+        </w:rPr>
+        <w:t xml:space="preserve">What to do:</w:t>
+      </w:r>
+    </w:p>
+    <w:p>
+      <w:pPr>
+        <w:pStyle w:val="ListBullet"/>
+        <w:spacing w:after="80"/>
+      </w:pPr>
+      <w:r>
+        <w:t xml:space="preserve">Run the comparison (it takes about 30 seconds) and press PrtScn when it finishes.</w:t>
+      </w:r>
+    </w:p>
+    <w:p>
+      <w:pPr>
+        <w:shd w:val="clear" w:color="auto" w:fill="F2F2F2"/>
+        <w:spacing w:after="0" w:line="240" w:lineRule="auto"/>
+        <w:ind w:left="288"/>
+      </w:pPr>
+      <w:r>
+        <w:rPr>
+          <w:rFonts w:ascii="Consolas" w:hAnsi="Consolas"/>
+          <w:sz w:val="18"/>
+        </w:rPr>
+        <w:t xml:space="preserve">python scripts/compare_chunking.py</w:t>
+      </w:r>
+    </w:p>
+    <w:p/>
+    <w:p>
+      <w:pPr>
+        <w:keepNext/>
+        <w:spacing w:after="80"/>
+      </w:pPr>
+      <w:r>
+        <w:rPr>
+          <w:b/>
+        </w:rPr>
+        <w:t xml:space="preserve">What must be visible:</w:t>
+      </w:r>
+    </w:p>
+    <w:p>
+      <w:pPr>
+        <w:pStyle w:val="ListBullet"/>
+        <w:spacing w:after="80"/>
+      </w:pPr>
+      <w:r>
+        <w:t xml:space="preserve">The table with both methods: number of chunks, sizes, how many chunks of the edited file are reused, and the speed.</w:t>
+      </w:r>
+    </w:p>
+    <w:p>
+      <w:pPr>
+        <w:pStyle w:val="ListBullet"/>
+        <w:spacing w:after="80"/>
+      </w:pPr>
+      <w:r>
+        <w:t xml:space="preserve">Fixed 4 MB reuses 0% after a 100-byte insertion, FastCDC reuses almost everything.</w:t>
+      </w:r>
+    </w:p>
+    <w:p>
+      <w:pPr>
+        <w:keepNext/>
+        <w:spacing w:after="80"/>
+      </w:pPr>
+      <w:r>
+        <w:rPr>
+          <w:b/>
+        </w:rPr>
+        <w:t xml:space="preserve">It should look like this (from our test run):</w:t>
+      </w:r>
+    </w:p>
+    <w:p>
+      <w:pPr>
+        <w:shd w:val="clear" w:color="auto" w:fill="F2F2F2"/>
+        <w:spacing w:after="0" w:line="240" w:lineRule="auto"/>
+        <w:ind w:left="288"/>
+      </w:pPr>
+      <w:r>
+        <w:rPr>
+          <w:rFonts w:ascii="Consolas" w:hAnsi="Consolas"/>
+          <w:sz w:val="18"/>
+        </w:rPr>
+        <w:t xml:space="preserve">method                 chunks      avg size         min         max       reused    dedup</w:t>
+      </w:r>
+    </w:p>
+    <w:p>
+      <w:pPr>
+        <w:shd w:val="clear" w:color="auto" w:fill="F2F2F2"/>
+        <w:spacing w:after="0" w:line="240" w:lineRule="auto"/>
+        <w:ind w:left="288"/>
+      </w:pPr>
+      <w:r>
+        <w:rPr>
+          <w:rFonts w:ascii="Consolas" w:hAnsi="Consolas"/>
+          <w:sz w:val="18"/>
+        </w:rPr>
+        <w:t xml:space="preserve">fixed 4 MB                 50       4015 KB        0 KB     4096 KB       0/51       0.0%</w:t>
+      </w:r>
+    </w:p>
+    <w:p>
+      <w:pPr>
+        <w:shd w:val="clear" w:color="auto" w:fill="F2F2F2"/>
+        <w:spacing w:after="0" w:line="240" w:lineRule="auto"/>
+        <w:ind w:left="288"/>
+      </w:pPr>
+      <w:r>
+        <w:rPr>
+          <w:rFonts w:ascii="Consolas" w:hAnsi="Consolas"/>
+          <w:sz w:val="18"/>
+        </w:rPr>
+        <w:t xml:space="preserve">FastCDC (avg ~4 MB)        46       4452 KB      698 KB     7464 KB      45/46      97.8%</w:t>
+      </w:r>
+    </w:p>
+    <w:p/>
+    <w:p>
+      <w:r>
+        <w:br w:type="page"/>
+      </w:r>
+    </w:p>
+    <w:p>
+      <w:pPr>
+        <w:keepNext/>
+        <w:spacing w:before="280" w:after="120"/>
+        <w:rPr>
+          <w:u w:val="single"/>
+        </w:rPr>
+      </w:pPr>
+      <w:r>
+        <w:rPr>
+          <w:b/>
+          <w:sz w:val="26"/>
+          <w:u w:val="single"/>
+        </w:rPr>
+        <w:t xml:space="preserve">Screenshot 10 : Placement: adding and removing a node</w:t>
+      </w:r>
+    </w:p>
+    <w:p>
+      <w:pPr>
+        <w:keepNext/>
+        <w:spacing w:after="80"/>
+      </w:pPr>
+      <w:r>
+        <w:rPr>
+          <w:b/>
+        </w:rPr>
+        <w:t xml:space="preserve">What to do:</w:t>
+      </w:r>
+    </w:p>
+    <w:p>
+      <w:pPr>
+        <w:pStyle w:val="ListBullet"/>
+        <w:spacing w:after="80"/>
+      </w:pPr>
+      <w:r>
+        <w:t xml:space="preserve">Run the placement test and press PrtScn when it finishes.</w:t>
+      </w:r>
+    </w:p>
+    <w:p>
+      <w:pPr>
+        <w:shd w:val="clear" w:color="auto" w:fill="F2F2F2"/>
+        <w:spacing w:after="0" w:line="240" w:lineRule="auto"/>
+        <w:ind w:left="288"/>
+      </w:pPr>
+      <w:r>
+        <w:rPr>
+          <w:rFonts w:ascii="Consolas" w:hAnsi="Consolas"/>
+          <w:sz w:val="18"/>
+        </w:rPr>
+        <w:t xml:space="preserve">python scripts/test_placement.py</w:t>
+      </w:r>
+    </w:p>
+    <w:p/>
+    <w:p>
+      <w:pPr>
+        <w:keepNext/>
+        <w:spacing w:after="80"/>
+      </w:pPr>
+      <w:r>
+        <w:rPr>
+          <w:b/>
+        </w:rPr>
+        <w:t xml:space="preserve">What must be visible:</w:t>
+      </w:r>
+    </w:p>
+    <w:p>
+      <w:pPr>
+        <w:pStyle w:val="ListBullet"/>
+        <w:spacing w:after="80"/>
+      </w:pPr>
+      <w:r>
+        <w:t xml:space="preserve">The load per node with 4 nodes (about 25% each).</w:t>
+      </w:r>
+    </w:p>
+    <w:p>
+      <w:pPr>
+        <w:pStyle w:val="ListBullet"/>
+        <w:spacing w:after="80"/>
+      </w:pPr>
+      <w:r>
+        <w:t xml:space="preserve">The table for adding node5 and removing node4: the ring moves close to the ideal 20% and 25%, while hash mod N moves 75 to 80%.</w:t>
+      </w:r>
+    </w:p>
+    <w:p>
+      <w:pPr>
+        <w:keepNext/>
+        <w:spacing w:after="80"/>
+      </w:pPr>
+      <w:r>
+        <w:rPr>
+          <w:b/>
+        </w:rPr>
+        <w:t xml:space="preserve">It should look like this (from our test run):</w:t>
+      </w:r>
+    </w:p>
+    <w:p>
+      <w:pPr>
+        <w:shd w:val="clear" w:color="auto" w:fill="F2F2F2"/>
+        <w:spacing w:after="0" w:line="240" w:lineRule="auto"/>
+        <w:ind w:left="288"/>
+      </w:pPr>
+      <w:r>
+        <w:rPr>
+          <w:rFonts w:ascii="Consolas" w:hAnsi="Consolas"/>
+          <w:sz w:val="18"/>
+        </w:rPr>
+        <w:t xml:space="preserve">Load with 4 nodes: node1 23.0%, node2 26.7%, node3 23.2%, node4 27.1%</w:t>
+      </w:r>
+    </w:p>
+    <w:p>
+      <w:pPr>
+        <w:shd w:val="clear" w:color="auto" w:fill="F2F2F2"/>
+        <w:spacing w:after="0" w:line="240" w:lineRule="auto"/>
+        <w:ind w:left="288"/>
+      </w:pPr>
+      <w:r>
+        <w:rPr>
+          <w:rFonts w:ascii="Consolas" w:hAnsi="Consolas"/>
+          <w:sz w:val="18"/>
+        </w:rPr>
+        <w:t xml:space="preserve">change                         ideal   ring (primary)   ring (all 3 copies)   hash mod N</w:t>
+      </w:r>
+    </w:p>
+    <w:p>
+      <w:pPr>
+        <w:shd w:val="clear" w:color="auto" w:fill="F2F2F2"/>
+        <w:spacing w:after="0" w:line="240" w:lineRule="auto"/>
+        <w:ind w:left="288"/>
+      </w:pPr>
+      <w:r>
+        <w:rPr>
+          <w:rFonts w:ascii="Consolas" w:hAnsi="Consolas"/>
+          <w:sz w:val="18"/>
+        </w:rPr>
+        <w:t xml:space="preserve">add node5 (4 -&gt; 5 nodes)       20.0%            18.5%                 21.5%        79.7%</w:t>
+      </w:r>
+    </w:p>
+    <w:p>
+      <w:pPr>
+        <w:shd w:val="clear" w:color="auto" w:fill="F2F2F2"/>
+        <w:spacing w:after="0" w:line="240" w:lineRule="auto"/>
+        <w:ind w:left="288"/>
+      </w:pPr>
+      <w:r>
+        <w:rPr>
+          <w:rFonts w:ascii="Consolas" w:hAnsi="Consolas"/>
+          <w:sz w:val="18"/>
+        </w:rPr>
+        <w:t xml:space="preserve">remove node4 (4 -&gt; 3 nodes)    25.0%            27.1%                 24.5%        75.0%</w:t>
+      </w:r>
+    </w:p>
+    <w:p/>
     <w:sectPr>
       <w:pgSz w:w="11909" w:h="16834"/>
       <w:pgMar w:top="1296" w:right="1440" w:bottom="1296" w:left="1440" w:header="720" w:footer="720" w:gutter="0"/>

</xml_diff>

<commit_message>
Add replication with quorums, erasure coding, repair, gateway, web UI and Elasticsearch search
Co-Authored-By: Claude Opus 5.5 <noreply@anthropic.com>
</commit_message>
<xml_diff>
--- a/Screenshot Guide.docx
+++ b/Screenshot Guide.docx
@@ -832,7 +832,7 @@
           <w:sz w:val="26"/>
           <w:u w:val="single"/>
         </w:rPr>
-        <w:t xml:space="preserve">Screenshot 4 : Four storage nodes running in separate containers</w:t>
+        <w:t xml:space="preserve">Screenshot 4 : Eight storage nodes running in separate containers</w:t>
       </w:r>
     </w:p>
     <w:p>
@@ -944,7 +944,7 @@
         <w:spacing w:after="80"/>
       </w:pPr>
       <w:r>
-        <w:t xml:space="preserve">The docker compose ps table: postgres, metadata, node1, node2, node3 and node4, all Up, with ports 9001 to 9004 for the nodes and 8000 for the metadata service.</w:t>
+        <w:t xml:space="preserve">The docker compose ps table: node1 to node8, metadata, gateway, postgres and elasticsearch, all Up, with ports 9001 to 9008 for the nodes.</w:t>
       </w:r>
     </w:p>
     <w:p>
@@ -953,7 +953,7 @@
         <w:spacing w:after="80"/>
       </w:pPr>
       <w:r>
-        <w:t xml:space="preserve">The metadata log lines "node node1 is UP" to "node node4 is UP": the heartbeats arriving.</w:t>
+        <w:t xml:space="preserve">The metadata log lines "node node1 is UP" to "node node8 is UP": the heartbeats arriving.</w:t>
       </w:r>
     </w:p>
     <w:p>
@@ -1063,7 +1063,7 @@
           <w:rFonts w:ascii="Consolas" w:hAnsi="Consolas"/>
           <w:sz w:val="18"/>
         </w:rPr>
-        <w:t xml:space="preserve">postgres   Up 14 seconds   0.0.0.0:5433-&gt;5432/tcp</w:t>
+        <w:t xml:space="preserve">...        (node5 to node8 on ports 9005 to 9008, plus gateway and elasticsearch)</w:t>
       </w:r>
     </w:p>
     <w:p>
@@ -1077,7 +1077,7 @@
           <w:rFonts w:ascii="Consolas" w:hAnsi="Consolas"/>
           <w:sz w:val="18"/>
         </w:rPr>
-        <w:t xml:space="preserve">metadata-1  | [metadata] node node4 is UP at http://node4:9000</w:t>
+        <w:t xml:space="preserve">postgres   Up 14 seconds   0.0.0.0:5433-&gt;5432/tcp</w:t>
       </w:r>
     </w:p>
     <w:p>
@@ -1091,6 +1091,20 @@
           <w:rFonts w:ascii="Consolas" w:hAnsi="Consolas"/>
           <w:sz w:val="18"/>
         </w:rPr>
+        <w:t xml:space="preserve">metadata-1  | [metadata] node node4 is UP at http://node4:9000</w:t>
+      </w:r>
+    </w:p>
+    <w:p>
+      <w:pPr>
+        <w:shd w:val="clear" w:color="auto" w:fill="F2F2F2"/>
+        <w:spacing w:after="0" w:line="240" w:lineRule="auto"/>
+        <w:ind w:left="288"/>
+      </w:pPr>
+      <w:r>
+        <w:rPr>
+          <w:rFonts w:ascii="Consolas" w:hAnsi="Consolas"/>
+          <w:sz w:val="18"/>
+        </w:rPr>
         <w:t xml:space="preserve">metadata-1  | [metadata] node node1 is UP at http://node1:9000</w:t>
       </w:r>
     </w:p>
@@ -1158,7 +1172,7 @@
           <w:rFonts w:ascii="Consolas" w:hAnsi="Consolas"/>
           <w:sz w:val="18"/>
         </w:rPr>
-        <w:t xml:space="preserve">http://localhost:8000/nodes</w:t>
+        <w:t xml:space="preserve">http://localhost:8080/status?api_key=dev-key-123</w:t>
       </w:r>
     </w:p>
     <w:p/>
@@ -1180,7 +1194,7 @@
         <w:spacing w:after="80"/>
       </w:pPr>
       <w:r>
-        <w:t xml:space="preserve">One entry for each of node1 to node4 with its node_id, free_bytes, chunk_count, alive: true and seconds_since_heartbeat below 3.</w:t>
+        <w:t xml:space="preserve">In "nodes": one entry for each of node1 to node8 with its node_id, free_bytes, chunk_count, alive: true and seconds_since_heartbeat below 3.</w:t>
       </w:r>
     </w:p>
     <w:p>
@@ -1494,7 +1508,7 @@
         <w:spacing w:after="80"/>
       </w:pPr>
       <w:r>
-        <w:t xml:space="preserve">Upload two files: a small one with fixed chunks and a bigger one with content-defined chunks (any file of a few MB works for the second, for example a photo or a PDF; replace the path).</w:t>
+        <w:t xml:space="preserve">Go to the examples folder (cd examples). Create a bucket, then upload a small file with fixed chunks and the 12 MB sample file with content-defined chunks (if sample.bin is missing, use any file of a few MB and change the name).</w:t>
       </w:r>
     </w:p>
     <w:p>
@@ -1526,7 +1540,7 @@
           <w:rFonts w:ascii="Consolas" w:hAnsi="Consolas"/>
           <w:sz w:val="18"/>
         </w:rPr>
-        <w:t xml:space="preserve">curl.exe -T README.md http://localhost:8000/objects/demo/README.md</w:t>
+        <w:t xml:space="preserve">cd examples</w:t>
       </w:r>
     </w:p>
     <w:p>
@@ -1540,7 +1554,7 @@
           <w:rFonts w:ascii="Consolas" w:hAnsi="Consolas"/>
           <w:sz w:val="18"/>
         </w:rPr>
-        <w:t xml:space="preserve">curl.exe -T "C:\path\to\some-file.pdf" "http://localhost:8000/objects/demo/file.pdf?chunking=cdc"</w:t>
+        <w:t xml:space="preserve">curl.exe -H "X-API-Key: dev-key-123" -H "Content-Type: application/json" -d "@bucket-replication.json" http://localhost:8080/buckets</w:t>
       </w:r>
     </w:p>
     <w:p>
@@ -1554,59 +1568,7 @@
           <w:rFonts w:ascii="Consolas" w:hAnsi="Consolas"/>
           <w:sz w:val="18"/>
         </w:rPr>
-        <w:t xml:space="preserve">docker compose exec postgres psql -U storage -c "SELECT bucket, key, version, size, chunking, cardinality(chunk_hashes) AS chunks, created_at FROM objects;" -c "SELECT left(hash,16) AS chunk, size, refcount, nodes FROM chunks;"</w:t>
-      </w:r>
-    </w:p>
-    <w:p/>
-    <w:p>
-      <w:pPr>
-        <w:keepNext/>
-        <w:spacing w:after="80"/>
-      </w:pPr>
-      <w:r>
-        <w:rPr>
-          <w:b/>
-        </w:rPr>
-        <w:t xml:space="preserve">What must be visible:</w:t>
-      </w:r>
-    </w:p>
-    <w:p>
-      <w:pPr>
-        <w:pStyle w:val="ListBullet"/>
-        <w:spacing w:after="80"/>
-      </w:pPr>
-      <w:r>
-        <w:t xml:space="preserve">The two upload answers (version, size, number of chunks, new and deduplicated chunks).</w:t>
-      </w:r>
-    </w:p>
-    <w:p>
-      <w:pPr>
-        <w:pStyle w:val="ListBullet"/>
-        <w:spacing w:after="80"/>
-      </w:pPr>
-      <w:r>
-        <w:t xml:space="preserve">The objects table: bucket, key, version, size, chunking, chunk count, creation date.</w:t>
-      </w:r>
-    </w:p>
-    <w:p>
-      <w:pPr>
-        <w:pStyle w:val="ListBullet"/>
-        <w:spacing w:after="80"/>
-      </w:pPr>
-      <w:r>
-        <w:t xml:space="preserve">The chunks table: each chunk with its size, reference count and the 3 nodes chosen by the ring.</w:t>
-      </w:r>
-    </w:p>
-    <w:p>
-      <w:pPr>
-        <w:keepNext/>
-        <w:spacing w:after="80"/>
-      </w:pPr>
-      <w:r>
-        <w:rPr>
-          <w:b/>
-        </w:rPr>
-        <w:t xml:space="preserve">It should look like this (from our test run):</w:t>
+        <w:t xml:space="preserve">curl.exe -H "X-API-Key: dev-key-123" -T hello.txt http://localhost:8080/buckets/photos/objects/hello.txt</w:t>
       </w:r>
     </w:p>
     <w:p>
@@ -1620,7 +1582,7 @@
           <w:rFonts w:ascii="Consolas" w:hAnsi="Consolas"/>
           <w:sz w:val="18"/>
         </w:rPr>
-        <w:t xml:space="preserve"> bucket |    key     | version |  size   | chunking | chunks |          created_at</w:t>
+        <w:t xml:space="preserve">curl.exe -H "X-API-Key: dev-key-123" -T sample.bin "http://localhost:8080/buckets/photos/objects/sample.bin?chunking=cdc"</w:t>
       </w:r>
     </w:p>
     <w:p>
@@ -1634,7 +1596,59 @@
           <w:rFonts w:ascii="Consolas" w:hAnsi="Consolas"/>
           <w:sz w:val="18"/>
         </w:rPr>
-        <w:t xml:space="preserve"> demo   | README.md  |       1 |     558 | fixed    |      1 | 2026-10-29 09:58:05+00</w:t>
+        <w:t xml:space="preserve">docker compose exec postgres psql -U storage -c "SELECT bucket, key, version, size, chunking, cardinality(chunk_hashes) AS chunks, created_at FROM objects;" -c "SELECT left(hash,16) AS chunk, size, refcount, nodes FROM chunks;"</w:t>
+      </w:r>
+    </w:p>
+    <w:p/>
+    <w:p>
+      <w:pPr>
+        <w:keepNext/>
+        <w:spacing w:after="80"/>
+      </w:pPr>
+      <w:r>
+        <w:rPr>
+          <w:b/>
+        </w:rPr>
+        <w:t xml:space="preserve">What must be visible:</w:t>
+      </w:r>
+    </w:p>
+    <w:p>
+      <w:pPr>
+        <w:pStyle w:val="ListBullet"/>
+        <w:spacing w:after="80"/>
+      </w:pPr>
+      <w:r>
+        <w:t xml:space="preserve">The two upload answers (version, size, number of chunks, new and deduplicated chunks).</w:t>
+      </w:r>
+    </w:p>
+    <w:p>
+      <w:pPr>
+        <w:pStyle w:val="ListBullet"/>
+        <w:spacing w:after="80"/>
+      </w:pPr>
+      <w:r>
+        <w:t xml:space="preserve">The objects table: bucket, key, version, size, chunking, chunk count, creation date.</w:t>
+      </w:r>
+    </w:p>
+    <w:p>
+      <w:pPr>
+        <w:pStyle w:val="ListBullet"/>
+        <w:spacing w:after="80"/>
+      </w:pPr>
+      <w:r>
+        <w:t xml:space="preserve">The chunks table: each chunk with its size, reference count and the 3 nodes chosen by the ring.</w:t>
+      </w:r>
+    </w:p>
+    <w:p>
+      <w:pPr>
+        <w:keepNext/>
+        <w:spacing w:after="80"/>
+      </w:pPr>
+      <w:r>
+        <w:rPr>
+          <w:b/>
+        </w:rPr>
+        <w:t xml:space="preserve">It should look like this (from our test run):</w:t>
       </w:r>
     </w:p>
     <w:p>
@@ -1648,7 +1662,7 @@
           <w:rFonts w:ascii="Consolas" w:hAnsi="Consolas"/>
           <w:sz w:val="18"/>
         </w:rPr>
-        <w:t xml:space="preserve"> demo   | random.bin |       1 | 9000000 | cdc      |      2 | 2026-10-29 09:58:05+00</w:t>
+        <w:t xml:space="preserve"> bucket |    key     | version |   size   | chunking | chunks |          created_at</w:t>
       </w:r>
     </w:p>
     <w:p>
@@ -1662,7 +1676,7 @@
           <w:rFonts w:ascii="Consolas" w:hAnsi="Consolas"/>
           <w:sz w:val="18"/>
         </w:rPr>
-        <w:t xml:space="preserve"/>
+        <w:t xml:space="preserve"> photos | hello.txt  |       1 |       53 | fixed    |      1 | 2026-10-29 10:20:26+00</w:t>
       </w:r>
     </w:p>
     <w:p>
@@ -1676,7 +1690,7 @@
           <w:rFonts w:ascii="Consolas" w:hAnsi="Consolas"/>
           <w:sz w:val="18"/>
         </w:rPr>
-        <w:t xml:space="preserve">      chunk       |  size   | refcount |        nodes</w:t>
+        <w:t xml:space="preserve"> photos | sample.bin |       1 | 12000000 | cdc      |      4 | 2026-10-29 10:20:26+00</w:t>
       </w:r>
     </w:p>
     <w:p>
@@ -1690,7 +1704,7 @@
           <w:rFonts w:ascii="Consolas" w:hAnsi="Consolas"/>
           <w:sz w:val="18"/>
         </w:rPr>
-        <w:t xml:space="preserve"> c1c80b27690e7748 |     558 |        1 | {node3,node1,node4}</w:t>
+        <w:t xml:space="preserve"/>
       </w:r>
     </w:p>
     <w:p>
@@ -1704,6 +1718,34 @@
           <w:rFonts w:ascii="Consolas" w:hAnsi="Consolas"/>
           <w:sz w:val="18"/>
         </w:rPr>
+        <w:t xml:space="preserve">      chunk       |  size   | refcount |        nodes</w:t>
+      </w:r>
+    </w:p>
+    <w:p>
+      <w:pPr>
+        <w:shd w:val="clear" w:color="auto" w:fill="F2F2F2"/>
+        <w:spacing w:after="0" w:line="240" w:lineRule="auto"/>
+        <w:ind w:left="288"/>
+      </w:pPr>
+      <w:r>
+        <w:rPr>
+          <w:rFonts w:ascii="Consolas" w:hAnsi="Consolas"/>
+          <w:sz w:val="18"/>
+        </w:rPr>
+        <w:t xml:space="preserve"> c1c80b27690e7748 |     558 |        1 | {node3,node1,node4}</w:t>
+      </w:r>
+    </w:p>
+    <w:p>
+      <w:pPr>
+        <w:shd w:val="clear" w:color="auto" w:fill="F2F2F2"/>
+        <w:spacing w:after="0" w:line="240" w:lineRule="auto"/>
+        <w:ind w:left="288"/>
+      </w:pPr>
+      <w:r>
+        <w:rPr>
+          <w:rFonts w:ascii="Consolas" w:hAnsi="Consolas"/>
+          <w:sz w:val="18"/>
+        </w:rPr>
         <w:t xml:space="preserve"> 908e896b44d43520 | 4848633 |        1 | {node1,node4,node3}</w:t>
       </w:r>
     </w:p>
@@ -2158,7 +2200,7 @@
         <w:spacing w:after="80"/>
       </w:pPr>
       <w:r>
-        <w:t xml:space="preserve">The load per node with 4 nodes (about 25% each).</w:t>
+        <w:t xml:space="preserve">The load per node with 8 nodes (about 12.5% each).</w:t>
       </w:r>
     </w:p>
     <w:p>
@@ -2167,7 +2209,7 @@
         <w:spacing w:after="80"/>
       </w:pPr>
       <w:r>
-        <w:t xml:space="preserve">The table for adding node5 and removing node4: the ring moves close to the ideal 20% and 25%, while hash mod N moves 75 to 80%.</w:t>
+        <w:t xml:space="preserve">The table for adding node9 and removing node8: the ring moves close to the ideal 11% and 12.5%, while hash mod N moves almost 90%.</w:t>
       </w:r>
     </w:p>
     <w:p>
@@ -2193,7 +2235,7 @@
           <w:rFonts w:ascii="Consolas" w:hAnsi="Consolas"/>
           <w:sz w:val="18"/>
         </w:rPr>
-        <w:t xml:space="preserve">Load with 4 nodes: node1 23.0%, node2 26.7%, node3 23.2%, node4 27.1%</w:t>
+        <w:t xml:space="preserve">Load with 8 nodes: node1 13.2%, node2 14.6%, node3 13.2%, node4 14.2%, node5 10.8%, ...</w:t>
       </w:r>
     </w:p>
     <w:p>
@@ -2221,7 +2263,7 @@
           <w:rFonts w:ascii="Consolas" w:hAnsi="Consolas"/>
           <w:sz w:val="18"/>
         </w:rPr>
-        <w:t xml:space="preserve">add node5 (4 -&gt; 5 nodes)       20.0%            18.5%                 21.5%        79.7%</w:t>
+        <w:t xml:space="preserve">add node9 (8 -&gt; 9 nodes)       11.1%            10.1%                 11.0%        88.9%</w:t>
       </w:r>
     </w:p>
     <w:p>
@@ -2235,10 +2277,1256 @@
           <w:rFonts w:ascii="Consolas" w:hAnsi="Consolas"/>
           <w:sz w:val="18"/>
         </w:rPr>
-        <w:t xml:space="preserve">remove node4 (4 -&gt; 3 nodes)    25.0%            27.1%                 24.5%        75.0%</w:t>
+        <w:t xml:space="preserve">remove node8 (8 -&gt; 7 nodes)    12.5%            10.9%                 11.6%        87.6%</w:t>
       </w:r>
     </w:p>
     <w:p/>
+    <w:p>
+      <w:r>
+        <w:br w:type="page"/>
+      </w:r>
+    </w:p>
+    <w:p>
+      <w:pPr>
+        <w:keepNext/>
+        <w:spacing w:before="280" w:after="120"/>
+        <w:rPr>
+          <w:u w:val="single"/>
+        </w:rPr>
+      </w:pPr>
+      <w:r>
+        <w:rPr>
+          <w:b/>
+          <w:sz w:val="26"/>
+          <w:u w:val="single"/>
+        </w:rPr>
+        <w:t xml:space="preserve">Phase 4 : Redundancy and recovery</w:t>
+      </w:r>
+    </w:p>
+    <w:p>
+      <w:pPr>
+        <w:keepNext/>
+        <w:spacing w:before="280" w:after="120"/>
+        <w:rPr>
+          <w:u w:val="single"/>
+        </w:rPr>
+      </w:pPr>
+      <w:r>
+        <w:rPr>
+          <w:b/>
+          <w:sz w:val="26"/>
+          <w:u w:val="single"/>
+        </w:rPr>
+        <w:t xml:space="preserve">Screenshot 11 : Quorum reads and writes, erasure coding</w:t>
+      </w:r>
+    </w:p>
+    <w:p>
+      <w:pPr>
+        <w:keepNext/>
+        <w:spacing w:after="80"/>
+      </w:pPr>
+      <w:r>
+        <w:rPr>
+          <w:b/>
+        </w:rPr>
+        <w:t xml:space="preserve">What to do:</w:t>
+      </w:r>
+    </w:p>
+    <w:p>
+      <w:pPr>
+        <w:pStyle w:val="ListBullet"/>
+        <w:spacing w:after="80"/>
+      </w:pPr>
+      <w:r>
+        <w:t xml:space="preserve">Run the failure test. It stops and starts storage nodes by itself and takes about 2 minutes.</w:t>
+      </w:r>
+    </w:p>
+    <w:p>
+      <w:pPr>
+        <w:pStyle w:val="ListBullet"/>
+        <w:spacing w:after="80"/>
+      </w:pPr>
+      <w:r>
+        <w:t xml:space="preserve">When it reaches "4. Automatic repair", scroll so parts 1, 2 and 3 are visible and press PrtScn.</w:t>
+      </w:r>
+    </w:p>
+    <w:p>
+      <w:pPr>
+        <w:shd w:val="clear" w:color="auto" w:fill="F2F2F2"/>
+        <w:spacing w:after="0" w:line="240" w:lineRule="auto"/>
+        <w:ind w:left="288"/>
+      </w:pPr>
+      <w:r>
+        <w:rPr>
+          <w:rFonts w:ascii="Consolas" w:hAnsi="Consolas"/>
+          <w:sz w:val="18"/>
+        </w:rPr>
+        <w:t xml:space="preserve">python scripts/test_redundancy.py</w:t>
+      </w:r>
+    </w:p>
+    <w:p/>
+    <w:p>
+      <w:pPr>
+        <w:keepNext/>
+        <w:spacing w:after="80"/>
+      </w:pPr>
+      <w:r>
+        <w:rPr>
+          <w:b/>
+        </w:rPr>
+        <w:t xml:space="preserve">What must be visible:</w:t>
+      </w:r>
+    </w:p>
+    <w:p>
+      <w:pPr>
+        <w:pStyle w:val="ListBullet"/>
+        <w:spacing w:after="80"/>
+      </w:pPr>
+      <w:r>
+        <w:t xml:space="preserve">Part 1: with one copy's node down the read works; with two down it is refused (read quorum R=2).</w:t>
+      </w:r>
+    </w:p>
+    <w:p>
+      <w:pPr>
+        <w:pStyle w:val="ListBullet"/>
+        <w:spacing w:after="80"/>
+      </w:pPr>
+      <w:r>
+        <w:t xml:space="preserve">Part 2: with 7 of 8 nodes down the upload is refused (write quorum W=2).</w:t>
+      </w:r>
+    </w:p>
+    <w:p>
+      <w:pPr>
+        <w:pStyle w:val="ListBullet"/>
+        <w:spacing w:after="80"/>
+      </w:pPr>
+      <w:r>
+        <w:t xml:space="preserve">Part 3: erasure coding rebuilds the chunk with 2 nodes down and refuses with 3 down.</w:t>
+      </w:r>
+    </w:p>
+    <w:p>
+      <w:pPr>
+        <w:pStyle w:val="ListBullet"/>
+        <w:spacing w:after="80"/>
+      </w:pPr>
+      <w:r>
+        <w:t xml:space="preserve">The disk use line: replication 3.0x, erasure coding 1.5x.</w:t>
+      </w:r>
+    </w:p>
+    <w:p>
+      <w:pPr>
+        <w:keepNext/>
+        <w:spacing w:after="80"/>
+      </w:pPr>
+      <w:r>
+        <w:rPr>
+          <w:b/>
+        </w:rPr>
+        <w:t xml:space="preserve">It should look like this (from our test run):</w:t>
+      </w:r>
+    </w:p>
+    <w:p>
+      <w:pPr>
+        <w:shd w:val="clear" w:color="auto" w:fill="F2F2F2"/>
+        <w:spacing w:after="0" w:line="240" w:lineRule="auto"/>
+        <w:ind w:left="288"/>
+      </w:pPr>
+      <w:r>
+        <w:rPr>
+          <w:rFonts w:ascii="Consolas" w:hAnsi="Consolas"/>
+          <w:sz w:val="18"/>
+        </w:rPr>
+        <w:t xml:space="preserve">1. Replication N=3, W=2, R=2</w:t>
+      </w:r>
+    </w:p>
+    <w:p>
+      <w:pPr>
+        <w:shd w:val="clear" w:color="auto" w:fill="F2F2F2"/>
+        <w:spacing w:after="0" w:line="240" w:lineRule="auto"/>
+        <w:ind w:left="288"/>
+      </w:pPr>
+      <w:r>
+        <w:rPr>
+          <w:rFonts w:ascii="Consolas" w:hAnsi="Consolas"/>
+          <w:sz w:val="18"/>
+        </w:rPr>
+        <w:t xml:space="preserve">  PASS  one copy's node down: the read still works (2 copies confirm, R=2)</w:t>
+      </w:r>
+    </w:p>
+    <w:p>
+      <w:pPr>
+        <w:shd w:val="clear" w:color="auto" w:fill="F2F2F2"/>
+        <w:spacing w:after="0" w:line="240" w:lineRule="auto"/>
+        <w:ind w:left="288"/>
+      </w:pPr>
+      <w:r>
+        <w:rPr>
+          <w:rFonts w:ascii="Consolas" w:hAnsi="Consolas"/>
+          <w:sz w:val="18"/>
+        </w:rPr>
+        <w:t xml:space="preserve">  PASS  two copies' nodes down: the read is refused (only 1 copy, R=2)</w:t>
+      </w:r>
+    </w:p>
+    <w:p>
+      <w:pPr>
+        <w:shd w:val="clear" w:color="auto" w:fill="F2F2F2"/>
+        <w:spacing w:after="0" w:line="240" w:lineRule="auto"/>
+        <w:ind w:left="288"/>
+      </w:pPr>
+      <w:r>
+        <w:rPr>
+          <w:rFonts w:ascii="Consolas" w:hAnsi="Consolas"/>
+          <w:sz w:val="18"/>
+        </w:rPr>
+        <w:t xml:space="preserve">2. Write quorum W=2</w:t>
+      </w:r>
+    </w:p>
+    <w:p>
+      <w:pPr>
+        <w:shd w:val="clear" w:color="auto" w:fill="F2F2F2"/>
+        <w:spacing w:after="0" w:line="240" w:lineRule="auto"/>
+        <w:ind w:left="288"/>
+      </w:pPr>
+      <w:r>
+        <w:rPr>
+          <w:rFonts w:ascii="Consolas" w:hAnsi="Consolas"/>
+          <w:sz w:val="18"/>
+        </w:rPr>
+        <w:t xml:space="preserve">  PASS  7 of 8 nodes down: the upload is refused   (write quorum not met: 1 of 3 copies stored, W=2)</w:t>
+      </w:r>
+    </w:p>
+    <w:p>
+      <w:pPr>
+        <w:shd w:val="clear" w:color="auto" w:fill="F2F2F2"/>
+        <w:spacing w:after="0" w:line="240" w:lineRule="auto"/>
+        <w:ind w:left="288"/>
+      </w:pPr>
+      <w:r>
+        <w:rPr>
+          <w:rFonts w:ascii="Consolas" w:hAnsi="Consolas"/>
+          <w:sz w:val="18"/>
+        </w:rPr>
+        <w:t xml:space="preserve">3. Erasure coding 4+2</w:t>
+      </w:r>
+    </w:p>
+    <w:p>
+      <w:pPr>
+        <w:shd w:val="clear" w:color="auto" w:fill="F2F2F2"/>
+        <w:spacing w:after="0" w:line="240" w:lineRule="auto"/>
+        <w:ind w:left="288"/>
+      </w:pPr>
+      <w:r>
+        <w:rPr>
+          <w:rFonts w:ascii="Consolas" w:hAnsi="Consolas"/>
+          <w:sz w:val="18"/>
+        </w:rPr>
+        <w:t xml:space="preserve">  PASS  2 nodes down: the chunk is rebuilt from the 4 remaining pieces</w:t>
+      </w:r>
+    </w:p>
+    <w:p>
+      <w:pPr>
+        <w:shd w:val="clear" w:color="auto" w:fill="F2F2F2"/>
+        <w:spacing w:after="0" w:line="240" w:lineRule="auto"/>
+        <w:ind w:left="288"/>
+      </w:pPr>
+      <w:r>
+        <w:rPr>
+          <w:rFonts w:ascii="Consolas" w:hAnsi="Consolas"/>
+          <w:sz w:val="18"/>
+        </w:rPr>
+        <w:t xml:space="preserve">  PASS  3 nodes down: only 3 pieces left, the read is refused</w:t>
+      </w:r>
+    </w:p>
+    <w:p>
+      <w:pPr>
+        <w:shd w:val="clear" w:color="auto" w:fill="F2F2F2"/>
+        <w:spacing w:after="0" w:line="240" w:lineRule="auto"/>
+        <w:ind w:left="288"/>
+      </w:pPr>
+      <w:r>
+        <w:rPr>
+          <w:rFonts w:ascii="Consolas" w:hAnsi="Consolas"/>
+          <w:sz w:val="18"/>
+        </w:rPr>
+        <w:t xml:space="preserve">     disk used for the same 6,291,456 bytes: replication 3.0x, erasure coding 1.5x</w:t>
+      </w:r>
+    </w:p>
+    <w:p/>
+    <w:p>
+      <w:r>
+        <w:br w:type="page"/>
+      </w:r>
+    </w:p>
+    <w:p>
+      <w:pPr>
+        <w:keepNext/>
+        <w:spacing w:before="280" w:after="120"/>
+        <w:rPr>
+          <w:u w:val="single"/>
+        </w:rPr>
+      </w:pPr>
+      <w:r>
+        <w:rPr>
+          <w:b/>
+          <w:sz w:val="26"/>
+          <w:u w:val="single"/>
+        </w:rPr>
+        <w:t xml:space="preserve">Screenshot 12 : Automatic repair after a node crash</w:t>
+      </w:r>
+    </w:p>
+    <w:p>
+      <w:pPr>
+        <w:keepNext/>
+        <w:spacing w:after="80"/>
+      </w:pPr>
+      <w:r>
+        <w:rPr>
+          <w:b/>
+        </w:rPr>
+        <w:t xml:space="preserve">What to do:</w:t>
+      </w:r>
+    </w:p>
+    <w:p>
+      <w:pPr>
+        <w:pStyle w:val="ListBullet"/>
+        <w:spacing w:after="80"/>
+      </w:pPr>
+      <w:r>
+        <w:t xml:space="preserve">In the same window, wait until the test has finished.</w:t>
+      </w:r>
+    </w:p>
+    <w:p>
+      <w:pPr>
+        <w:pStyle w:val="ListBullet"/>
+        <w:spacing w:after="80"/>
+      </w:pPr>
+      <w:r>
+        <w:t xml:space="preserve">Press PrtScn with part 4 visible.</w:t>
+      </w:r>
+    </w:p>
+    <w:p>
+      <w:pPr>
+        <w:keepNext/>
+        <w:spacing w:after="80"/>
+      </w:pPr>
+      <w:r>
+        <w:rPr>
+          <w:b/>
+        </w:rPr>
+        <w:t xml:space="preserve">What must be visible:</w:t>
+      </w:r>
+    </w:p>
+    <w:p>
+      <w:pPr>
+        <w:pStyle w:val="ListBullet"/>
+        <w:spacing w:after="80"/>
+      </w:pPr>
+      <w:r>
+        <w:t xml:space="preserve">A node killed, the objects becoming degraded, then repaired about 20 seconds after the crash.</w:t>
+      </w:r>
+    </w:p>
+    <w:p>
+      <w:pPr>
+        <w:pStyle w:val="ListBullet"/>
+        <w:spacing w:after="80"/>
+      </w:pPr>
+      <w:r>
+        <w:t xml:space="preserve">The chunk back to 3 copies and the erasure-coded chunk back to 6 pieces, on healthy nodes.</w:t>
+      </w:r>
+    </w:p>
+    <w:p>
+      <w:pPr>
+        <w:keepNext/>
+        <w:spacing w:after="80"/>
+      </w:pPr>
+      <w:r>
+        <w:rPr>
+          <w:b/>
+        </w:rPr>
+        <w:t xml:space="preserve">It should look like this (from our test run):</w:t>
+      </w:r>
+    </w:p>
+    <w:p>
+      <w:pPr>
+        <w:shd w:val="clear" w:color="auto" w:fill="F2F2F2"/>
+        <w:spacing w:after="0" w:line="240" w:lineRule="auto"/>
+        <w:ind w:left="288"/>
+      </w:pPr>
+      <w:r>
+        <w:rPr>
+          <w:rFonts w:ascii="Consolas" w:hAnsi="Consolas"/>
+          <w:sz w:val="18"/>
+        </w:rPr>
+        <w:t xml:space="preserve">4. Automatic repair</w:t>
+      </w:r>
+    </w:p>
+    <w:p>
+      <w:pPr>
+        <w:shd w:val="clear" w:color="auto" w:fill="F2F2F2"/>
+        <w:spacing w:after="0" w:line="240" w:lineRule="auto"/>
+        <w:ind w:left="288"/>
+      </w:pPr>
+      <w:r>
+        <w:rPr>
+          <w:rFonts w:ascii="Consolas" w:hAnsi="Consolas"/>
+          <w:sz w:val="18"/>
+        </w:rPr>
+        <w:t xml:space="preserve">     &gt;&gt; docker compose kill node3</w:t>
+      </w:r>
+    </w:p>
+    <w:p>
+      <w:pPr>
+        <w:shd w:val="clear" w:color="auto" w:fill="F2F2F2"/>
+        <w:spacing w:after="0" w:line="240" w:lineRule="auto"/>
+        <w:ind w:left="288"/>
+      </w:pPr>
+      <w:r>
+        <w:rPr>
+          <w:rFonts w:ascii="Consolas" w:hAnsi="Consolas"/>
+          <w:sz w:val="18"/>
+        </w:rPr>
+        <w:t xml:space="preserve">  PASS  node3 down: objects become degraded   (8 degraded objects)</w:t>
+      </w:r>
+    </w:p>
+    <w:p>
+      <w:pPr>
+        <w:shd w:val="clear" w:color="auto" w:fill="F2F2F2"/>
+        <w:spacing w:after="0" w:line="240" w:lineRule="auto"/>
+        <w:ind w:left="288"/>
+      </w:pPr>
+      <w:r>
+        <w:rPr>
+          <w:rFonts w:ascii="Consolas" w:hAnsi="Consolas"/>
+          <w:sz w:val="18"/>
+        </w:rPr>
+        <w:t xml:space="preserve">  PASS  the repair worker rebuilds every lost copy and piece   (14 chunks repaired, healthy again 20 s after the crash)</w:t>
+      </w:r>
+    </w:p>
+    <w:p>
+      <w:pPr>
+        <w:shd w:val="clear" w:color="auto" w:fill="F2F2F2"/>
+        <w:spacing w:after="0" w:line="240" w:lineRule="auto"/>
+        <w:ind w:left="288"/>
+      </w:pPr>
+      <w:r>
+        <w:rPr>
+          <w:rFonts w:ascii="Consolas" w:hAnsi="Consolas"/>
+          <w:sz w:val="18"/>
+        </w:rPr>
+        <w:t xml:space="preserve">  PASS  the first chunk has 3 copies again, on healthy nodes   (node5, node2, node4)</w:t>
+      </w:r>
+    </w:p>
+    <w:p>
+      <w:pPr>
+        <w:shd w:val="clear" w:color="auto" w:fill="F2F2F2"/>
+        <w:spacing w:after="0" w:line="240" w:lineRule="auto"/>
+        <w:ind w:left="288"/>
+      </w:pPr>
+      <w:r>
+        <w:rPr>
+          <w:rFonts w:ascii="Consolas" w:hAnsi="Consolas"/>
+          <w:sz w:val="18"/>
+        </w:rPr>
+        <w:t xml:space="preserve">  PASS  the erasure-coded chunk has its 6 pieces again</w:t>
+      </w:r>
+    </w:p>
+    <w:p/>
+    <w:p>
+      <w:r>
+        <w:br w:type="page"/>
+      </w:r>
+    </w:p>
+    <w:p>
+      <w:pPr>
+        <w:keepNext/>
+        <w:spacing w:before="280" w:after="120"/>
+        <w:rPr>
+          <w:u w:val="single"/>
+        </w:rPr>
+      </w:pPr>
+      <w:r>
+        <w:rPr>
+          <w:b/>
+          <w:sz w:val="26"/>
+          <w:u w:val="single"/>
+        </w:rPr>
+        <w:t xml:space="preserve">Phase 5 : The gateway API</w:t>
+      </w:r>
+    </w:p>
+    <w:p>
+      <w:pPr>
+        <w:keepNext/>
+        <w:spacing w:before="280" w:after="120"/>
+        <w:rPr>
+          <w:u w:val="single"/>
+        </w:rPr>
+      </w:pPr>
+      <w:r>
+        <w:rPr>
+          <w:b/>
+          <w:sz w:val="26"/>
+          <w:u w:val="single"/>
+        </w:rPr>
+        <w:t xml:space="preserve">Screenshot 13 : API tests with pytest</w:t>
+      </w:r>
+    </w:p>
+    <w:p>
+      <w:pPr>
+        <w:keepNext/>
+        <w:spacing w:after="80"/>
+      </w:pPr>
+      <w:r>
+        <w:rPr>
+          <w:b/>
+        </w:rPr>
+        <w:t xml:space="preserve">What to do:</w:t>
+      </w:r>
+    </w:p>
+    <w:p>
+      <w:pPr>
+        <w:pStyle w:val="ListBullet"/>
+        <w:spacing w:after="80"/>
+      </w:pPr>
+      <w:r>
+        <w:t xml:space="preserve">Run the test suite and press PrtScn when it finishes.</w:t>
+      </w:r>
+    </w:p>
+    <w:p>
+      <w:pPr>
+        <w:shd w:val="clear" w:color="auto" w:fill="F2F2F2"/>
+        <w:spacing w:after="0" w:line="240" w:lineRule="auto"/>
+        <w:ind w:left="288"/>
+      </w:pPr>
+      <w:r>
+        <w:rPr>
+          <w:rFonts w:ascii="Consolas" w:hAnsi="Consolas"/>
+          <w:sz w:val="18"/>
+        </w:rPr>
+        <w:t xml:space="preserve">pytest -v tests/test_api.py</w:t>
+      </w:r>
+    </w:p>
+    <w:p/>
+    <w:p>
+      <w:pPr>
+        <w:keepNext/>
+        <w:spacing w:after="80"/>
+      </w:pPr>
+      <w:r>
+        <w:rPr>
+          <w:b/>
+        </w:rPr>
+        <w:t xml:space="preserve">What must be visible:</w:t>
+      </w:r>
+    </w:p>
+    <w:p>
+      <w:pPr>
+        <w:pStyle w:val="ListBullet"/>
+        <w:spacing w:after="80"/>
+      </w:pPr>
+      <w:r>
+        <w:t xml:space="preserve">The 20 tests (authentication, rate limiting, buckets, upload and download for both redundancy types, byte ranges, versions, listing, delete, search, status), all PASSED.</w:t>
+      </w:r>
+    </w:p>
+    <w:p>
+      <w:pPr>
+        <w:pStyle w:val="ListBullet"/>
+        <w:spacing w:after="80"/>
+      </w:pPr>
+      <w:r>
+        <w:t xml:space="preserve">The last line: 20 passed.</w:t>
+      </w:r>
+    </w:p>
+    <w:p>
+      <w:r>
+        <w:br w:type="page"/>
+      </w:r>
+    </w:p>
+    <w:p>
+      <w:pPr>
+        <w:keepNext/>
+        <w:spacing w:before="280" w:after="120"/>
+        <w:rPr>
+          <w:u w:val="single"/>
+        </w:rPr>
+      </w:pPr>
+      <w:r>
+        <w:rPr>
+          <w:b/>
+          <w:sz w:val="26"/>
+          <w:u w:val="single"/>
+        </w:rPr>
+        <w:t xml:space="preserve">Screenshot 14 : The API with curl</w:t>
+      </w:r>
+    </w:p>
+    <w:p>
+      <w:pPr>
+        <w:keepNext/>
+        <w:spacing w:after="80"/>
+      </w:pPr>
+      <w:r>
+        <w:rPr>
+          <w:b/>
+        </w:rPr>
+        <w:t xml:space="preserve">What to do:</w:t>
+      </w:r>
+    </w:p>
+    <w:p>
+      <w:pPr>
+        <w:pStyle w:val="ListBullet"/>
+        <w:spacing w:after="80"/>
+      </w:pPr>
+      <w:r>
+        <w:t xml:space="preserve">Go to the examples folder and run the commands one after the other (create the photos bucket of Screenshot 7 first if you have not yet).</w:t>
+      </w:r>
+    </w:p>
+    <w:p>
+      <w:pPr>
+        <w:pStyle w:val="ListBullet"/>
+        <w:spacing w:after="80"/>
+      </w:pPr>
+      <w:r>
+        <w:t xml:space="preserve">Press PrtScn when the last one has printed.</w:t>
+      </w:r>
+    </w:p>
+    <w:p>
+      <w:pPr>
+        <w:shd w:val="clear" w:color="auto" w:fill="F2F2F2"/>
+        <w:spacing w:after="0" w:line="240" w:lineRule="auto"/>
+        <w:ind w:left="288"/>
+      </w:pPr>
+      <w:r>
+        <w:rPr>
+          <w:rFonts w:ascii="Consolas" w:hAnsi="Consolas"/>
+          <w:sz w:val="18"/>
+        </w:rPr>
+        <w:t xml:space="preserve">cd examples</w:t>
+      </w:r>
+    </w:p>
+    <w:p>
+      <w:pPr>
+        <w:shd w:val="clear" w:color="auto" w:fill="F2F2F2"/>
+        <w:spacing w:after="0" w:line="240" w:lineRule="auto"/>
+        <w:ind w:left="288"/>
+      </w:pPr>
+      <w:r>
+        <w:rPr>
+          <w:rFonts w:ascii="Consolas" w:hAnsi="Consolas"/>
+          <w:sz w:val="18"/>
+        </w:rPr>
+        <w:t xml:space="preserve">curl.exe http://localhost:8080/buckets</w:t>
+      </w:r>
+    </w:p>
+    <w:p>
+      <w:pPr>
+        <w:shd w:val="clear" w:color="auto" w:fill="F2F2F2"/>
+        <w:spacing w:after="0" w:line="240" w:lineRule="auto"/>
+        <w:ind w:left="288"/>
+      </w:pPr>
+      <w:r>
+        <w:rPr>
+          <w:rFonts w:ascii="Consolas" w:hAnsi="Consolas"/>
+          <w:sz w:val="18"/>
+        </w:rPr>
+        <w:t xml:space="preserve">curl.exe -H "X-API-Key: dev-key-123" -H "Content-Type: application/json" -d "@bucket-ec.json" http://localhost:8080/buckets</w:t>
+      </w:r>
+    </w:p>
+    <w:p>
+      <w:pPr>
+        <w:shd w:val="clear" w:color="auto" w:fill="F2F2F2"/>
+        <w:spacing w:after="0" w:line="240" w:lineRule="auto"/>
+        <w:ind w:left="288"/>
+      </w:pPr>
+      <w:r>
+        <w:rPr>
+          <w:rFonts w:ascii="Consolas" w:hAnsi="Consolas"/>
+          <w:sz w:val="18"/>
+        </w:rPr>
+        <w:t xml:space="preserve">curl.exe -H "X-API-Key: dev-key-123" -H "X-Tag-Type: video" -T sample.bin http://localhost:8080/buckets/videos/objects/clips/sample.bin</w:t>
+      </w:r>
+    </w:p>
+    <w:p>
+      <w:pPr>
+        <w:shd w:val="clear" w:color="auto" w:fill="F2F2F2"/>
+        <w:spacing w:after="0" w:line="240" w:lineRule="auto"/>
+        <w:ind w:left="288"/>
+      </w:pPr>
+      <w:r>
+        <w:rPr>
+          <w:rFonts w:ascii="Consolas" w:hAnsi="Consolas"/>
+          <w:sz w:val="18"/>
+        </w:rPr>
+        <w:t xml:space="preserve">curl.exe -i -H "X-API-Key: dev-key-123" -H "Range: bytes=0-15" http://localhost:8080/buckets/photos/objects/hello.txt</w:t>
+      </w:r>
+    </w:p>
+    <w:p>
+      <w:pPr>
+        <w:shd w:val="clear" w:color="auto" w:fill="F2F2F2"/>
+        <w:spacing w:after="0" w:line="240" w:lineRule="auto"/>
+        <w:ind w:left="288"/>
+      </w:pPr>
+      <w:r>
+        <w:rPr>
+          <w:rFonts w:ascii="Consolas" w:hAnsi="Consolas"/>
+          <w:sz w:val="18"/>
+        </w:rPr>
+        <w:t xml:space="preserve">curl.exe -H "X-API-Key: dev-key-123" "http://localhost:8080/search?tag=type:video"</w:t>
+      </w:r>
+    </w:p>
+    <w:p>
+      <w:pPr>
+        <w:shd w:val="clear" w:color="auto" w:fill="F2F2F2"/>
+        <w:spacing w:after="0" w:line="240" w:lineRule="auto"/>
+        <w:ind w:left="288"/>
+      </w:pPr>
+      <w:r>
+        <w:rPr>
+          <w:rFonts w:ascii="Consolas" w:hAnsi="Consolas"/>
+          <w:sz w:val="18"/>
+        </w:rPr>
+        <w:t xml:space="preserve">1..6 | % { curl.exe -s -o NUL -w "%{http_code} " -H "X-API-Key: slow-key-789" http://localhost:8080/buckets }</w:t>
+      </w:r>
+    </w:p>
+    <w:p/>
+    <w:p>
+      <w:pPr>
+        <w:keepNext/>
+        <w:spacing w:after="80"/>
+      </w:pPr>
+      <w:r>
+        <w:rPr>
+          <w:b/>
+        </w:rPr>
+        <w:t xml:space="preserve">What must be visible:</w:t>
+      </w:r>
+    </w:p>
+    <w:p>
+      <w:pPr>
+        <w:pStyle w:val="ListBullet"/>
+        <w:spacing w:after="80"/>
+      </w:pPr>
+      <w:r>
+        <w:t xml:space="preserve">401 (missing API key) for the first command.</w:t>
+      </w:r>
+    </w:p>
+    <w:p>
+      <w:pPr>
+        <w:pStyle w:val="ListBullet"/>
+        <w:spacing w:after="80"/>
+      </w:pPr>
+      <w:r>
+        <w:t xml:space="preserve">The erasure-coded bucket created, and the upload answer with "erasure coding 4+2".</w:t>
+      </w:r>
+    </w:p>
+    <w:p>
+      <w:pPr>
+        <w:pStyle w:val="ListBullet"/>
+        <w:spacing w:after="80"/>
+      </w:pPr>
+      <w:r>
+        <w:t xml:space="preserve">HTTP/1.1 206 Partial Content with content-range: bytes 0-15/53.</w:t>
+      </w:r>
+    </w:p>
+    <w:p>
+      <w:pPr>
+        <w:pStyle w:val="ListBullet"/>
+        <w:spacing w:after="80"/>
+      </w:pPr>
+      <w:r>
+        <w:t xml:space="preserve">The search result with "engine":"elasticsearch".</w:t>
+      </w:r>
+    </w:p>
+    <w:p>
+      <w:pPr>
+        <w:pStyle w:val="ListBullet"/>
+        <w:spacing w:after="80"/>
+      </w:pPr>
+      <w:r>
+        <w:t xml:space="preserve">200 200 200 200 429 429: the rate limit refusing requests.</w:t>
+      </w:r>
+    </w:p>
+    <w:p>
+      <w:r>
+        <w:br w:type="page"/>
+      </w:r>
+    </w:p>
+    <w:p>
+      <w:pPr>
+        <w:keepNext/>
+        <w:spacing w:before="280" w:after="120"/>
+        <w:rPr>
+          <w:u w:val="single"/>
+        </w:rPr>
+      </w:pPr>
+      <w:r>
+        <w:rPr>
+          <w:b/>
+          <w:sz w:val="26"/>
+          <w:u w:val="single"/>
+        </w:rPr>
+        <w:t xml:space="preserve">Screenshot 15 : Interactive API documentation</w:t>
+      </w:r>
+    </w:p>
+    <w:p>
+      <w:pPr>
+        <w:keepNext/>
+        <w:spacing w:after="80"/>
+      </w:pPr>
+      <w:r>
+        <w:rPr>
+          <w:b/>
+        </w:rPr>
+        <w:t xml:space="preserve">What to do:</w:t>
+      </w:r>
+    </w:p>
+    <w:p>
+      <w:pPr>
+        <w:pStyle w:val="ListBullet"/>
+        <w:spacing w:after="80"/>
+      </w:pPr>
+      <w:r>
+        <w:t xml:space="preserve">Open http://localhost:8080/docs in the browser.</w:t>
+      </w:r>
+    </w:p>
+    <w:p>
+      <w:pPr>
+        <w:pStyle w:val="ListBullet"/>
+        <w:spacing w:after="80"/>
+      </w:pPr>
+      <w:r>
+        <w:t xml:space="preserve">Expand one endpoint (for example GET /search), maximize the window and press PrtScn.</w:t>
+      </w:r>
+    </w:p>
+    <w:p>
+      <w:pPr>
+        <w:keepNext/>
+        <w:spacing w:after="80"/>
+      </w:pPr>
+      <w:r>
+        <w:rPr>
+          <w:b/>
+        </w:rPr>
+        <w:t xml:space="preserve">What must be visible:</w:t>
+      </w:r>
+    </w:p>
+    <w:p>
+      <w:pPr>
+        <w:pStyle w:val="ListBullet"/>
+        <w:spacing w:after="80"/>
+      </w:pPr>
+      <w:r>
+        <w:t xml:space="preserve">The list of gateway endpoints generated by FastAPI.</w:t>
+      </w:r>
+    </w:p>
+    <w:p>
+      <w:r>
+        <w:br w:type="page"/>
+      </w:r>
+    </w:p>
+    <w:p>
+      <w:pPr>
+        <w:keepNext/>
+        <w:spacing w:before="280" w:after="120"/>
+        <w:rPr>
+          <w:u w:val="single"/>
+        </w:rPr>
+      </w:pPr>
+      <w:r>
+        <w:rPr>
+          <w:b/>
+          <w:sz w:val="26"/>
+          <w:u w:val="single"/>
+        </w:rPr>
+        <w:t xml:space="preserve">Phase 6 : The web UI</w:t>
+      </w:r>
+    </w:p>
+    <w:p>
+      <w:pPr>
+        <w:keepNext/>
+        <w:spacing w:before="280" w:after="120"/>
+        <w:rPr>
+          <w:u w:val="single"/>
+        </w:rPr>
+      </w:pPr>
+      <w:r>
+        <w:rPr>
+          <w:b/>
+          <w:sz w:val="26"/>
+          <w:u w:val="single"/>
+        </w:rPr>
+        <w:t xml:space="preserve">Screenshot 16 : Browsing and uploading objects</w:t>
+      </w:r>
+    </w:p>
+    <w:p>
+      <w:pPr>
+        <w:keepNext/>
+        <w:spacing w:after="80"/>
+      </w:pPr>
+      <w:r>
+        <w:rPr>
+          <w:b/>
+        </w:rPr>
+        <w:t xml:space="preserve">What to do:</w:t>
+      </w:r>
+    </w:p>
+    <w:p>
+      <w:pPr>
+        <w:pStyle w:val="ListBullet"/>
+        <w:spacing w:after="80"/>
+      </w:pPr>
+      <w:r>
+        <w:t xml:space="preserve">Open http://localhost:8080 in the browser (the API key dev-key-123 is already filled in).</w:t>
+      </w:r>
+    </w:p>
+    <w:p>
+      <w:pPr>
+        <w:pStyle w:val="ListBullet"/>
+        <w:spacing w:after="80"/>
+      </w:pPr>
+      <w:r>
+        <w:t xml:space="preserve">Click the bucket photos. Choose a file, type tags such as type=photo, year=2026, and click Upload.</w:t>
+      </w:r>
+    </w:p>
+    <w:p>
+      <w:pPr>
+        <w:pStyle w:val="ListBullet"/>
+        <w:spacing w:after="80"/>
+      </w:pPr>
+      <w:r>
+        <w:t xml:space="preserve">Click Info on the uploaded file so its chunks are shown.</w:t>
+      </w:r>
+    </w:p>
+    <w:p>
+      <w:pPr>
+        <w:pStyle w:val="ListBullet"/>
+        <w:spacing w:after="80"/>
+      </w:pPr>
+      <w:r>
+        <w:t xml:space="preserve">Maximize the window and press PrtScn.</w:t>
+      </w:r>
+    </w:p>
+    <w:p>
+      <w:pPr>
+        <w:keepNext/>
+        <w:spacing w:after="80"/>
+      </w:pPr>
+      <w:r>
+        <w:rPr>
+          <w:b/>
+        </w:rPr>
+        <w:t xml:space="preserve">What must be visible:</w:t>
+      </w:r>
+    </w:p>
+    <w:p>
+      <w:pPr>
+        <w:pStyle w:val="ListBullet"/>
+        <w:spacing w:after="80"/>
+      </w:pPr>
+      <w:r>
+        <w:t xml:space="preserve">The bucket list with the protection of each bucket.</w:t>
+      </w:r>
+    </w:p>
+    <w:p>
+      <w:pPr>
+        <w:pStyle w:val="ListBullet"/>
+        <w:spacing w:after="80"/>
+      </w:pPr>
+      <w:r>
+        <w:t xml:space="preserve">The upload message (chunks, new, deduplicated) and the object list with its tags.</w:t>
+      </w:r>
+    </w:p>
+    <w:p>
+      <w:pPr>
+        <w:pStyle w:val="ListBullet"/>
+        <w:spacing w:after="80"/>
+      </w:pPr>
+      <w:r>
+        <w:t xml:space="preserve">The Info panel: each chunk's SHA-256, size, the nodes holding it, and 3/3 healthy copies.</w:t>
+      </w:r>
+    </w:p>
+    <w:p>
+      <w:r>
+        <w:br w:type="page"/>
+      </w:r>
+    </w:p>
+    <w:p>
+      <w:pPr>
+        <w:keepNext/>
+        <w:spacing w:before="280" w:after="120"/>
+        <w:rPr>
+          <w:u w:val="single"/>
+        </w:rPr>
+      </w:pPr>
+      <w:r>
+        <w:rPr>
+          <w:b/>
+          <w:sz w:val="26"/>
+          <w:u w:val="single"/>
+        </w:rPr>
+        <w:t xml:space="preserve">Screenshot 17 : Searching with Elasticsearch</w:t>
+      </w:r>
+    </w:p>
+    <w:p>
+      <w:pPr>
+        <w:keepNext/>
+        <w:spacing w:after="80"/>
+      </w:pPr>
+      <w:r>
+        <w:rPr>
+          <w:b/>
+        </w:rPr>
+        <w:t xml:space="preserve">What to do:</w:t>
+      </w:r>
+    </w:p>
+    <w:p>
+      <w:pPr>
+        <w:pStyle w:val="ListBullet"/>
+        <w:spacing w:after="80"/>
+      </w:pPr>
+      <w:r>
+        <w:t xml:space="preserve">Click the Search tab. Type type=video in the tags field and click Search.</w:t>
+      </w:r>
+    </w:p>
+    <w:p>
+      <w:pPr>
+        <w:pStyle w:val="ListBullet"/>
+        <w:spacing w:after="80"/>
+      </w:pPr>
+      <w:r>
+        <w:t xml:space="preserve">Press PrtScn.</w:t>
+      </w:r>
+    </w:p>
+    <w:p>
+      <w:pPr>
+        <w:keepNext/>
+        <w:spacing w:after="80"/>
+      </w:pPr>
+      <w:r>
+        <w:rPr>
+          <w:b/>
+        </w:rPr>
+        <w:t xml:space="preserve">What must be visible:</w:t>
+      </w:r>
+    </w:p>
+    <w:p>
+      <w:pPr>
+        <w:pStyle w:val="ListBullet"/>
+        <w:spacing w:after="80"/>
+      </w:pPr>
+      <w:r>
+        <w:t xml:space="preserve">The results, and "searched with elasticsearch" next to the number of results.</w:t>
+      </w:r>
+    </w:p>
+    <w:p>
+      <w:r>
+        <w:br w:type="page"/>
+      </w:r>
+    </w:p>
+    <w:p>
+      <w:pPr>
+        <w:keepNext/>
+        <w:spacing w:before="280" w:after="120"/>
+        <w:rPr>
+          <w:u w:val="single"/>
+        </w:rPr>
+      </w:pPr>
+      <w:r>
+        <w:rPr>
+          <w:b/>
+          <w:sz w:val="26"/>
+          <w:u w:val="single"/>
+        </w:rPr>
+        <w:t xml:space="preserve">Screenshot 18 : Cluster state</w:t>
+      </w:r>
+    </w:p>
+    <w:p>
+      <w:pPr>
+        <w:keepNext/>
+        <w:spacing w:after="80"/>
+      </w:pPr>
+      <w:r>
+        <w:rPr>
+          <w:b/>
+        </w:rPr>
+        <w:t xml:space="preserve">What to do:</w:t>
+      </w:r>
+    </w:p>
+    <w:p>
+      <w:pPr>
+        <w:pStyle w:val="ListBullet"/>
+        <w:spacing w:after="80"/>
+      </w:pPr>
+      <w:r>
+        <w:t xml:space="preserve">Click the Cluster tab and press PrtScn.</w:t>
+      </w:r>
+    </w:p>
+    <w:p>
+      <w:pPr>
+        <w:keepNext/>
+        <w:spacing w:after="80"/>
+      </w:pPr>
+      <w:r>
+        <w:rPr>
+          <w:b/>
+        </w:rPr>
+        <w:t xml:space="preserve">What must be visible:</w:t>
+      </w:r>
+    </w:p>
+    <w:p>
+      <w:pPr>
+        <w:pStyle w:val="ListBullet"/>
+        <w:spacing w:after="80"/>
+      </w:pPr>
+      <w:r>
+        <w:t xml:space="preserve">8/8 nodes up, objects, bytes stored, dedup ratio, 0 degraded objects.</w:t>
+      </w:r>
+    </w:p>
+    <w:p>
+      <w:pPr>
+        <w:pStyle w:val="ListBullet"/>
+        <w:spacing w:after="80"/>
+      </w:pPr>
+      <w:r>
+        <w:t xml:space="preserve">Every node card green with its last heartbeat, free space and pieces on disk.</w:t>
+      </w:r>
+    </w:p>
+    <w:p>
+      <w:pPr>
+        <w:pStyle w:val="ListBullet"/>
+        <w:spacing w:after="80"/>
+      </w:pPr>
+      <w:r>
+        <w:t xml:space="preserve">The chunk distribution bars and the Repair panel.</w:t>
+      </w:r>
+    </w:p>
+    <w:p>
+      <w:r>
+        <w:br w:type="page"/>
+      </w:r>
+    </w:p>
+    <w:p>
+      <w:pPr>
+        <w:keepNext/>
+        <w:spacing w:before="280" w:after="120"/>
+        <w:rPr>
+          <w:u w:val="single"/>
+        </w:rPr>
+      </w:pPr>
+      <w:r>
+        <w:rPr>
+          <w:b/>
+          <w:sz w:val="26"/>
+          <w:u w:val="single"/>
+        </w:rPr>
+        <w:t xml:space="preserve">Screenshot 19 : Cluster state during a failure and the repair</w:t>
+      </w:r>
+    </w:p>
+    <w:p>
+      <w:pPr>
+        <w:keepNext/>
+        <w:spacing w:after="80"/>
+      </w:pPr>
+      <w:r>
+        <w:rPr>
+          <w:b/>
+        </w:rPr>
+        <w:t xml:space="preserve">What to do:</w:t>
+      </w:r>
+    </w:p>
+    <w:p>
+      <w:pPr>
+        <w:pStyle w:val="ListBullet"/>
+        <w:spacing w:after="80"/>
+      </w:pPr>
+      <w:r>
+        <w:t xml:space="preserve">Keep the Cluster tab open. In PowerShell, crash one node with the first command.</w:t>
+      </w:r>
+    </w:p>
+    <w:p>
+      <w:pPr>
+        <w:pStyle w:val="ListBullet"/>
+        <w:spacing w:after="80"/>
+      </w:pPr>
+      <w:r>
+        <w:t xml:space="preserve">After about 10 seconds the node card turns red and degraded objects appear: press PrtScn (19a).</w:t>
+      </w:r>
+    </w:p>
+    <w:p>
+      <w:pPr>
+        <w:pStyle w:val="ListBullet"/>
+        <w:spacing w:after="80"/>
+      </w:pPr>
+      <w:r>
+        <w:t xml:space="preserve">About 20 seconds after the crash the repair runs and degraded objects go back to 0: press PrtScn again (19b).</w:t>
+      </w:r>
+    </w:p>
+    <w:p>
+      <w:pPr>
+        <w:pStyle w:val="ListBullet"/>
+        <w:spacing w:after="80"/>
+      </w:pPr>
+      <w:r>
+        <w:t xml:space="preserve">Start the node again with the second command.</w:t>
+      </w:r>
+    </w:p>
+    <w:p>
+      <w:pPr>
+        <w:shd w:val="clear" w:color="auto" w:fill="F2F2F2"/>
+        <w:spacing w:after="0" w:line="240" w:lineRule="auto"/>
+        <w:ind w:left="288"/>
+      </w:pPr>
+      <w:r>
+        <w:rPr>
+          <w:rFonts w:ascii="Consolas" w:hAnsi="Consolas"/>
+          <w:sz w:val="18"/>
+        </w:rPr>
+        <w:t xml:space="preserve">docker compose kill node2</w:t>
+      </w:r>
+    </w:p>
+    <w:p>
+      <w:pPr>
+        <w:shd w:val="clear" w:color="auto" w:fill="F2F2F2"/>
+        <w:spacing w:after="0" w:line="240" w:lineRule="auto"/>
+        <w:ind w:left="288"/>
+      </w:pPr>
+      <w:r>
+        <w:rPr>
+          <w:rFonts w:ascii="Consolas" w:hAnsi="Consolas"/>
+          <w:sz w:val="18"/>
+        </w:rPr>
+        <w:t xml:space="preserve">docker compose start node2</w:t>
+      </w:r>
+    </w:p>
+    <w:p/>
+    <w:p>
+      <w:pPr>
+        <w:keepNext/>
+        <w:spacing w:after="80"/>
+      </w:pPr>
+      <w:r>
+        <w:rPr>
+          <w:b/>
+        </w:rPr>
+        <w:t xml:space="preserve">What must be visible:</w:t>
+      </w:r>
+    </w:p>
+    <w:p>
+      <w:pPr>
+        <w:pStyle w:val="ListBullet"/>
+        <w:spacing w:after="80"/>
+      </w:pPr>
+      <w:r>
+        <w:t xml:space="preserve">19a: node2 DOWN in red, degraded objects above 0, the degraded objects listed in the Repair panel.</w:t>
+      </w:r>
+    </w:p>
+    <w:p>
+      <w:pPr>
+        <w:pStyle w:val="ListBullet"/>
+        <w:spacing w:after="80"/>
+      </w:pPr>
+      <w:r>
+        <w:t xml:space="preserve">19b: 0 degraded objects, and the Repair panel showing the chunks repaired and the time of the last run.</w:t>
+      </w:r>
+    </w:p>
     <w:sectPr>
       <w:pgSz w:w="11909" w:h="16834"/>
       <w:pgMar w:top="1296" w:right="1440" w:bottom="1296" w:left="1440" w:header="720" w:footer="720" w:gutter="0"/>

</xml_diff>